<commit_message>
Update Kontakt Home CV - add 3 new Embafinans bullets (sales channel, dashboard/SIMA, scoring model), fit to 1 page
</commit_message>
<xml_diff>
--- a/Zamir_Camalov_BA_CV_EN.docx
+++ b/Zamir_Camalov_BA_CV_EN.docx
@@ -4,7 +4,7 @@
   <w:body>
     <w:p>
       <w:pPr>
-        <w:spacing w:after="40" w:before="200" w:line="276"/>
+        <w:spacing w:after="30" w:before="160" w:line="276"/>
         <w:jc w:val="left"/>
       </w:pPr>
       <w:r>
@@ -14,22 +14,22 @@
           <w:bCs/>
           <w:color w:val="1A1A1A"/>
           <w:spacing w:val="120"/>
-          <w:sz w:val="36"/>
-          <w:szCs w:val="36"/>
+          <w:sz w:val="34"/>
+          <w:szCs w:val="34"/>
         </w:rPr>
         <w:t xml:space="preserve">ZAMIR CAMALOV</w:t>
       </w:r>
     </w:p>
     <w:p>
       <w:pPr>
-        <w:spacing w:after="60" w:before="0" w:line="276"/>
+        <w:spacing w:after="50" w:before="0" w:line="276"/>
       </w:pPr>
       <w:r>
         <w:rPr>
           <w:rFonts w:ascii="Calibri" w:eastAsia="Microsoft YaHei"/>
           <w:color w:val="2A6496"/>
-          <w:sz w:val="22"/>
-          <w:szCs w:val="22"/>
+          <w:sz w:val="21"/>
+          <w:szCs w:val="21"/>
         </w:rPr>
         <w:t xml:space="preserve">IT Business Analyst  |  E-Commerce &amp; Fintech</w:t>
       </w:r>
@@ -47,11 +47,11 @@
         </w:tblBorders>
       </w:tblPr>
       <w:tblGrid>
-        <w:gridCol w:w="9506"/>
+        <w:gridCol w:w="9906"/>
       </w:tblGrid>
       <w:tr>
         <w:trPr>
-          <w:trHeight w:val="280" w:hRule="atLeast"/>
+          <w:trHeight w:val="260" w:hRule="atLeast"/>
         </w:trPr>
         <w:tc>
           <w:tcPr>
@@ -66,14 +66,14 @@
           </w:tcPr>
           <w:p>
             <w:pPr>
-              <w:spacing w:after="40" w:before="40"/>
+              <w:spacing w:after="30" w:before="30"/>
             </w:pPr>
             <w:r>
               <w:rPr>
                 <w:rFonts w:ascii="Calibri" w:eastAsia="Microsoft YaHei"/>
                 <w:color w:val="777777"/>
-                <w:sz w:val="17"/>
-                <w:szCs w:val="17"/>
+                <w:sz w:val="16"/>
+                <w:szCs w:val="16"/>
               </w:rPr>
               <w:t xml:space="preserve">+994 55 207 7228</w:t>
             </w:r>
@@ -81,8 +81,8 @@
               <w:rPr>
                 <w:rFonts w:ascii="Calibri" w:eastAsia="Microsoft YaHei"/>
                 <w:color w:val="CCCCCC"/>
-                <w:sz w:val="17"/>
-                <w:szCs w:val="17"/>
+                <w:sz w:val="16"/>
+                <w:szCs w:val="16"/>
               </w:rPr>
               <w:t xml:space="preserve">   |   </w:t>
             </w:r>
@@ -90,8 +90,8 @@
               <w:rPr>
                 <w:rFonts w:ascii="Calibri" w:eastAsia="Microsoft YaHei"/>
                 <w:color w:val="777777"/>
-                <w:sz w:val="17"/>
-                <w:szCs w:val="17"/>
+                <w:sz w:val="16"/>
+                <w:szCs w:val="16"/>
               </w:rPr>
               <w:t xml:space="preserve">jamalov.zamir@gmail.com</w:t>
             </w:r>
@@ -99,8 +99,8 @@
               <w:rPr>
                 <w:rFonts w:ascii="Calibri" w:eastAsia="Microsoft YaHei"/>
                 <w:color w:val="CCCCCC"/>
-                <w:sz w:val="17"/>
-                <w:szCs w:val="17"/>
+                <w:sz w:val="16"/>
+                <w:szCs w:val="16"/>
               </w:rPr>
               <w:t xml:space="preserve">   |   </w:t>
             </w:r>
@@ -108,8 +108,8 @@
               <w:rPr>
                 <w:rFonts w:ascii="Calibri" w:eastAsia="Microsoft YaHei"/>
                 <w:color w:val="777777"/>
-                <w:sz w:val="17"/>
-                <w:szCs w:val="17"/>
+                <w:sz w:val="16"/>
+                <w:szCs w:val="16"/>
               </w:rPr>
               <w:t xml:space="preserve">Baku, Azerbaijan</w:t>
             </w:r>
@@ -117,8 +117,8 @@
               <w:rPr>
                 <w:rFonts w:ascii="Calibri" w:eastAsia="Microsoft YaHei"/>
                 <w:color w:val="CCCCCC"/>
-                <w:sz w:val="17"/>
-                <w:szCs w:val="17"/>
+                <w:sz w:val="16"/>
+                <w:szCs w:val="16"/>
               </w:rPr>
               <w:t xml:space="preserve">   |   </w:t>
             </w:r>
@@ -126,8 +126,8 @@
               <w:rPr>
                 <w:rFonts w:ascii="Calibri" w:eastAsia="Microsoft YaHei"/>
                 <w:color w:val="2A6496"/>
-                <w:sz w:val="17"/>
-                <w:szCs w:val="17"/>
+                <w:sz w:val="16"/>
+                <w:szCs w:val="16"/>
                 <w:u w:val="single" w:color="2A6496"/>
               </w:rPr>
               <w:t xml:space="preserve">github.com/ZamirJamalov/ba-practice</w:t>
@@ -138,7 +138,7 @@
     </w:tbl>
     <w:p>
       <w:pPr>
-        <w:spacing w:after="0" w:before="100"/>
+        <w:spacing w:after="0" w:before="50"/>
       </w:pPr>
     </w:p>
     <w:tbl>
@@ -154,11 +154,11 @@
         </w:tblBorders>
       </w:tblPr>
       <w:tblGrid>
-        <w:gridCol w:w="9506"/>
+        <w:gridCol w:w="9906"/>
       </w:tblGrid>
       <w:tr>
         <w:trPr>
-          <w:trHeight w:val="350" w:hRule="exact"/>
+          <w:trHeight w:val="320" w:hRule="exact"/>
         </w:trPr>
         <w:tc>
           <w:tcPr>
@@ -173,7 +173,7 @@
           </w:tcPr>
           <w:p>
             <w:pPr>
-              <w:spacing w:after="40" w:before="80"/>
+              <w:spacing w:after="30" w:before="60"/>
             </w:pPr>
             <w:r>
               <w:rPr>
@@ -182,8 +182,8 @@
                 <w:bCs/>
                 <w:color w:val="2A6496"/>
                 <w:spacing w:val="80"/>
-                <w:sz w:val="20"/>
-                <w:szCs w:val="20"/>
+                <w:sz w:val="19"/>
+                <w:szCs w:val="19"/>
               </w:rPr>
               <w:t xml:space="preserve">PROFILE SUMMARY</w:t>
             </w:r>
@@ -193,27 +193,27 @@
     </w:tbl>
     <w:p>
       <w:pPr>
-        <w:spacing w:after="0" w:before="60"/>
-      </w:pPr>
-    </w:p>
-    <w:p>
-      <w:pPr>
-        <w:spacing w:after="20" w:before="20" w:line="276"/>
+        <w:spacing w:after="0" w:before="30"/>
+      </w:pPr>
+    </w:p>
+    <w:p>
+      <w:pPr>
+        <w:spacing w:after="16" w:before="16" w:line="260"/>
         <w:jc w:val="both"/>
       </w:pPr>
       <w:r>
         <w:rPr>
           <w:rFonts w:ascii="Calibri" w:eastAsia="Microsoft YaHei"/>
           <w:color w:val="333333"/>
-          <w:sz w:val="19"/>
-          <w:szCs w:val="19"/>
-        </w:rPr>
-        <w:t xml:space="preserve">IT Business Analyst with 3+ years of focused experience in E-Commerce (Marketplace) and Fintech (B2B integrations). Proven ability to discover business needs through stakeholder interviews, translate them into precise BRD/FRD specifications with User Stories and Acceptance Criteria, and coordinate end-to-end delivery from requirements gathering through UAT sign-off. Skilled in BPMN process modeling (As-Is / To-Be), REST API documentation (Swagger), and data-driven decision making via SQL analytics. Background in software engineering enables fluent communication with development teams and accurate technical translation of business requirements.</w:t>
-      </w:r>
-    </w:p>
-    <w:p>
-      <w:pPr>
-        <w:spacing w:after="0" w:before="100"/>
+          <w:sz w:val="18"/>
+          <w:szCs w:val="18"/>
+        </w:rPr>
+        <w:t xml:space="preserve">IT Business Analyst with 3+ years of experience in E-Commerce and Fintech, skilled in stakeholder discovery, BRD/FRD authoring, BPMN process modeling, REST API documentation (Swagger), SQL analytics, and end-to-end delivery coordination through UAT sign-off. Software engineering background enables precise technical translation of business requirements and efficient collaboration with development teams.</w:t>
+      </w:r>
+    </w:p>
+    <w:p>
+      <w:pPr>
+        <w:spacing w:after="0" w:before="50"/>
       </w:pPr>
     </w:p>
     <w:tbl>
@@ -229,11 +229,11 @@
         </w:tblBorders>
       </w:tblPr>
       <w:tblGrid>
-        <w:gridCol w:w="9506"/>
+        <w:gridCol w:w="9906"/>
       </w:tblGrid>
       <w:tr>
         <w:trPr>
-          <w:trHeight w:val="350" w:hRule="exact"/>
+          <w:trHeight w:val="320" w:hRule="exact"/>
         </w:trPr>
         <w:tc>
           <w:tcPr>
@@ -248,7 +248,7 @@
           </w:tcPr>
           <w:p>
             <w:pPr>
-              <w:spacing w:after="40" w:before="80"/>
+              <w:spacing w:after="30" w:before="60"/>
             </w:pPr>
             <w:r>
               <w:rPr>
@@ -257,8 +257,8 @@
                 <w:bCs/>
                 <w:color w:val="2A6496"/>
                 <w:spacing w:val="80"/>
-                <w:sz w:val="20"/>
-                <w:szCs w:val="20"/>
+                <w:sz w:val="19"/>
+                <w:szCs w:val="19"/>
               </w:rPr>
               <w:t xml:space="preserve">CORE SKILLS</w:t>
             </w:r>
@@ -268,12 +268,12 @@
     </w:tbl>
     <w:p>
       <w:pPr>
-        <w:spacing w:after="0" w:before="60"/>
-      </w:pPr>
-    </w:p>
-    <w:p>
-      <w:pPr>
-        <w:spacing w:after="40" w:before="40" w:line="276"/>
+        <w:spacing w:after="0" w:before="30"/>
+      </w:pPr>
+    </w:p>
+    <w:p>
+      <w:pPr>
+        <w:spacing w:after="30" w:before="30" w:line="260"/>
       </w:pPr>
       <w:r>
         <w:rPr>
@@ -281,16 +281,16 @@
           <w:b/>
           <w:bCs/>
           <w:color w:val="1A1A1A"/>
-          <w:sz w:val="19"/>
-          <w:szCs w:val="19"/>
+          <w:sz w:val="18"/>
+          <w:szCs w:val="18"/>
         </w:rPr>
         <w:t xml:space="preserve">Business Analysis</w:t>
       </w:r>
       <w:r>
         <w:rPr>
           <w:rFonts w:ascii="Calibri" w:eastAsia="Microsoft YaHei"/>
-          <w:sz w:val="19"/>
-          <w:szCs w:val="19"/>
+          <w:sz w:val="18"/>
+          <w:szCs w:val="18"/>
         </w:rPr>
         <w:t xml:space="preserve">   </w:t>
       </w:r>
@@ -298,15 +298,15 @@
         <w:rPr>
           <w:rFonts w:ascii="Calibri" w:eastAsia="Microsoft YaHei"/>
           <w:color w:val="333333"/>
-          <w:sz w:val="19"/>
-          <w:szCs w:val="19"/>
+          <w:sz w:val="18"/>
+          <w:szCs w:val="18"/>
         </w:rPr>
         <w:t xml:space="preserve">BRD / FRD / SRS  |  User Stories &amp; Acceptance Criteria (Gherkin)  |  BPMN (As-Is / To-Be)  |  Gap Analysis  |  Stakeholder Interviews  |  Backlog Prioritization (WSJF / RICE)</w:t>
       </w:r>
     </w:p>
     <w:p>
       <w:pPr>
-        <w:spacing w:after="40" w:before="40" w:line="276"/>
+        <w:spacing w:after="30" w:before="30" w:line="260"/>
       </w:pPr>
       <w:r>
         <w:rPr>
@@ -314,16 +314,16 @@
           <w:b/>
           <w:bCs/>
           <w:color w:val="1A1A1A"/>
-          <w:sz w:val="19"/>
-          <w:szCs w:val="19"/>
+          <w:sz w:val="18"/>
+          <w:szCs w:val="18"/>
         </w:rPr>
         <w:t xml:space="preserve">Technical</w:t>
       </w:r>
       <w:r>
         <w:rPr>
           <w:rFonts w:ascii="Calibri" w:eastAsia="Microsoft YaHei"/>
-          <w:sz w:val="19"/>
-          <w:szCs w:val="19"/>
+          <w:sz w:val="18"/>
+          <w:szCs w:val="18"/>
         </w:rPr>
         <w:t xml:space="preserve">   </w:t>
       </w:r>
@@ -331,15 +331,15 @@
         <w:rPr>
           <w:rFonts w:ascii="Calibri" w:eastAsia="Microsoft YaHei"/>
           <w:color w:val="333333"/>
-          <w:sz w:val="19"/>
-          <w:szCs w:val="19"/>
+          <w:sz w:val="18"/>
+          <w:szCs w:val="18"/>
         </w:rPr>
         <w:t xml:space="preserve">REST API &amp; JSON  |  Swagger / OpenAPI 3.0  |  Postman (API Testing)  |  SQL (JOIN, GROUP BY, Subqueries)  |  SDLC</w:t>
       </w:r>
     </w:p>
     <w:p>
       <w:pPr>
-        <w:spacing w:after="40" w:before="40" w:line="276"/>
+        <w:spacing w:after="30" w:before="30" w:line="260"/>
       </w:pPr>
       <w:r>
         <w:rPr>
@@ -347,16 +347,16 @@
           <w:b/>
           <w:bCs/>
           <w:color w:val="1A1A1A"/>
-          <w:sz w:val="19"/>
-          <w:szCs w:val="19"/>
+          <w:sz w:val="18"/>
+          <w:szCs w:val="18"/>
         </w:rPr>
         <w:t xml:space="preserve">Process &amp; Tools</w:t>
       </w:r>
       <w:r>
         <w:rPr>
           <w:rFonts w:ascii="Calibri" w:eastAsia="Microsoft YaHei"/>
-          <w:sz w:val="19"/>
-          <w:szCs w:val="19"/>
+          <w:sz w:val="18"/>
+          <w:szCs w:val="18"/>
         </w:rPr>
         <w:t xml:space="preserve">   </w:t>
       </w:r>
@@ -364,15 +364,15 @@
         <w:rPr>
           <w:rFonts w:ascii="Calibri" w:eastAsia="Microsoft YaHei"/>
           <w:color w:val="333333"/>
-          <w:sz w:val="19"/>
-          <w:szCs w:val="19"/>
+          <w:sz w:val="18"/>
+          <w:szCs w:val="18"/>
         </w:rPr>
         <w:t xml:space="preserve">Agile / Scrum  |  Jira  |  Confluence  |  UAT Planning &amp; Coordination  |  L2 Production Support (ELK Stack)</w:t>
       </w:r>
     </w:p>
     <w:p>
       <w:pPr>
-        <w:spacing w:after="40" w:before="40" w:line="276"/>
+        <w:spacing w:after="30" w:before="30" w:line="260"/>
       </w:pPr>
       <w:r>
         <w:rPr>
@@ -380,16 +380,16 @@
           <w:b/>
           <w:bCs/>
           <w:color w:val="1A1A1A"/>
-          <w:sz w:val="19"/>
-          <w:szCs w:val="19"/>
+          <w:sz w:val="18"/>
+          <w:szCs w:val="18"/>
         </w:rPr>
         <w:t xml:space="preserve">Languages</w:t>
       </w:r>
       <w:r>
         <w:rPr>
           <w:rFonts w:ascii="Calibri" w:eastAsia="Microsoft YaHei"/>
-          <w:sz w:val="19"/>
-          <w:szCs w:val="19"/>
+          <w:sz w:val="18"/>
+          <w:szCs w:val="18"/>
         </w:rPr>
         <w:t xml:space="preserve">   </w:t>
       </w:r>
@@ -397,15 +397,15 @@
         <w:rPr>
           <w:rFonts w:ascii="Calibri" w:eastAsia="Microsoft YaHei"/>
           <w:color w:val="333333"/>
-          <w:sz w:val="19"/>
-          <w:szCs w:val="19"/>
+          <w:sz w:val="18"/>
+          <w:szCs w:val="18"/>
         </w:rPr>
         <w:t xml:space="preserve">Azerbaijani (Native)  |  Russian (Fluent)  |  English (Professional / Technical Documentation)</w:t>
       </w:r>
     </w:p>
     <w:p>
       <w:pPr>
-        <w:spacing w:after="0" w:before="100"/>
+        <w:spacing w:after="0" w:before="50"/>
       </w:pPr>
     </w:p>
     <w:tbl>
@@ -421,11 +421,11 @@
         </w:tblBorders>
       </w:tblPr>
       <w:tblGrid>
-        <w:gridCol w:w="9506"/>
+        <w:gridCol w:w="9906"/>
       </w:tblGrid>
       <w:tr>
         <w:trPr>
-          <w:trHeight w:val="350" w:hRule="exact"/>
+          <w:trHeight w:val="320" w:hRule="exact"/>
         </w:trPr>
         <w:tc>
           <w:tcPr>
@@ -440,7 +440,7 @@
           </w:tcPr>
           <w:p>
             <w:pPr>
-              <w:spacing w:after="40" w:before="80"/>
+              <w:spacing w:after="30" w:before="60"/>
             </w:pPr>
             <w:r>
               <w:rPr>
@@ -449,8 +449,8 @@
                 <w:bCs/>
                 <w:color w:val="2A6496"/>
                 <w:spacing w:val="80"/>
-                <w:sz w:val="20"/>
-                <w:szCs w:val="20"/>
+                <w:sz w:val="19"/>
+                <w:szCs w:val="19"/>
               </w:rPr>
               <w:t xml:space="preserve">PROFESSIONAL EXPERIENCE</w:t>
             </w:r>
@@ -460,15 +460,15 @@
     </w:tbl>
     <w:p>
       <w:pPr>
-        <w:spacing w:after="0" w:before="60"/>
+        <w:spacing w:after="0" w:before="30"/>
       </w:pPr>
     </w:p>
     <w:p>
       <w:pPr>
         <w:tabs>
-          <w:tab w:val="right" w:pos="9506"/>
+          <w:tab w:val="right" w:pos="9906"/>
         </w:tabs>
-        <w:spacing w:after="20" w:before="140" w:line="276"/>
+        <w:spacing w:after="16" w:before="120" w:line="260"/>
       </w:pPr>
       <w:r>
         <w:rPr>
@@ -476,8 +476,8 @@
           <w:b/>
           <w:bCs/>
           <w:color w:val="1A1A1A"/>
-          <w:sz w:val="21"/>
-          <w:szCs w:val="21"/>
+          <w:sz w:val="20"/>
+          <w:szCs w:val="20"/>
         </w:rPr>
         <w:t xml:space="preserve">Embafinans</w:t>
       </w:r>
@@ -485,8 +485,8 @@
         <w:rPr>
           <w:rFonts w:ascii="Calibri" w:eastAsia="Microsoft YaHei"/>
           <w:color w:val="777777"/>
-          <w:sz w:val="19"/>
-          <w:szCs w:val="19"/>
+          <w:sz w:val="18"/>
+          <w:szCs w:val="18"/>
         </w:rPr>
         <w:t xml:space="preserve">  |  </w:t>
       </w:r>
@@ -496,8 +496,8 @@
           <w:i/>
           <w:iCs/>
           <w:color w:val="333333"/>
-          <w:sz w:val="19"/>
-          <w:szCs w:val="19"/>
+          <w:sz w:val="18"/>
+          <w:szCs w:val="18"/>
         </w:rPr>
         <w:t xml:space="preserve">IT Business Analyst</w:t>
       </w:r>
@@ -511,23 +511,23 @@
         <w:rPr>
           <w:rFonts w:ascii="Calibri" w:eastAsia="Microsoft YaHei"/>
           <w:color w:val="777777"/>
-          <w:sz w:val="17"/>
-          <w:szCs w:val="17"/>
+          <w:sz w:val="16"/>
+          <w:szCs w:val="16"/>
         </w:rPr>
         <w:t xml:space="preserve">2025 – Present</w:t>
       </w:r>
     </w:p>
     <w:p>
       <w:pPr>
-        <w:spacing w:after="30" w:before="30" w:line="276"/>
-        <w:ind w:left="180" w:hanging="180"/>
+        <w:spacing w:after="16" w:before="16" w:line="260"/>
+        <w:ind w:left="160" w:hanging="160"/>
       </w:pPr>
       <w:r>
         <w:rPr>
           <w:rFonts w:ascii="Calibri" w:eastAsia="Microsoft YaHei"/>
           <w:color w:val="2A6496"/>
-          <w:sz w:val="19"/>
-          <w:szCs w:val="19"/>
+          <w:sz w:val="17"/>
+          <w:szCs w:val="17"/>
         </w:rPr>
         <w:t xml:space="preserve">•</w:t>
       </w:r>
@@ -535,23 +535,23 @@
         <w:rPr>
           <w:rFonts w:ascii="Calibri" w:eastAsia="Microsoft YaHei"/>
           <w:color w:val="333333"/>
-          <w:sz w:val="19"/>
-          <w:szCs w:val="19"/>
-        </w:rPr>
-        <w:t xml:space="preserve">  Conducted structured discovery sessions with credit risk experts and finance teams to map the As-Is BNPL credit scoring workflow, identified 3 bottleneck stages, and designed To-Be BPMN process models with exclusive gateways — reducing credit decision time by 50%</w:t>
-      </w:r>
-    </w:p>
-    <w:p>
-      <w:pPr>
-        <w:spacing w:after="30" w:before="30" w:line="276"/>
-        <w:ind w:left="180" w:hanging="180"/>
+          <w:sz w:val="17"/>
+          <w:szCs w:val="17"/>
+        </w:rPr>
+        <w:t xml:space="preserve">  Conducted structured discovery sessions with risk teams to map the As-Is BNPL credit scoring workflow, designed a pre-screen scoring model by integrating external data sources (AKB, ASANfinance) for multi-factor risk assessment, and created To-Be BPMN process models with exclusive gateways — reducing credit decision time by 50%</w:t>
+      </w:r>
+    </w:p>
+    <w:p>
+      <w:pPr>
+        <w:spacing w:after="16" w:before="16" w:line="260"/>
+        <w:ind w:left="160" w:hanging="160"/>
       </w:pPr>
       <w:r>
         <w:rPr>
           <w:rFonts w:ascii="Calibri" w:eastAsia="Microsoft YaHei"/>
           <w:color w:val="2A6496"/>
-          <w:sz w:val="19"/>
-          <w:szCs w:val="19"/>
+          <w:sz w:val="17"/>
+          <w:szCs w:val="17"/>
         </w:rPr>
         <w:t xml:space="preserve">•</w:t>
       </w:r>
@@ -559,23 +559,23 @@
         <w:rPr>
           <w:rFonts w:ascii="Calibri" w:eastAsia="Microsoft YaHei"/>
           <w:color w:val="333333"/>
-          <w:sz w:val="19"/>
-          <w:szCs w:val="19"/>
+          <w:sz w:val="17"/>
+          <w:szCs w:val="17"/>
         </w:rPr>
         <w:t xml:space="preserve">  Authored detailed FRDs with numbered requirements (REQ-101 format) and designed REST API specifications with Swagger/OpenAPI 3.0 documentation for 8+ endpoints covering partner onboarding, application management, and payment processing — ensuring zero-ambiguity handoff to the development team</w:t>
       </w:r>
     </w:p>
     <w:p>
       <w:pPr>
-        <w:spacing w:after="30" w:before="30" w:line="276"/>
-        <w:ind w:left="180" w:hanging="180"/>
+        <w:spacing w:after="16" w:before="16" w:line="260"/>
+        <w:ind w:left="160" w:hanging="160"/>
       </w:pPr>
       <w:r>
         <w:rPr>
           <w:rFonts w:ascii="Calibri" w:eastAsia="Microsoft YaHei"/>
           <w:color w:val="2A6496"/>
-          <w:sz w:val="19"/>
-          <w:szCs w:val="19"/>
+          <w:sz w:val="17"/>
+          <w:szCs w:val="17"/>
         </w:rPr>
         <w:t xml:space="preserve">•</w:t>
       </w:r>
@@ -583,23 +583,23 @@
         <w:rPr>
           <w:rFonts w:ascii="Calibri" w:eastAsia="Microsoft YaHei"/>
           <w:color w:val="333333"/>
-          <w:sz w:val="19"/>
-          <w:szCs w:val="19"/>
+          <w:sz w:val="17"/>
+          <w:szCs w:val="17"/>
         </w:rPr>
         <w:t xml:space="preserve">  Wrote User Stories with Given/When/Then Acceptance Criteria in Jira/Confluence, coordinated UAT execution with business stakeholders, and led bug triage meetings with QA and developers — achieving on-time sign-off for 3 release cycles</w:t>
       </w:r>
     </w:p>
     <w:p>
       <w:pPr>
-        <w:spacing w:after="30" w:before="30" w:line="276"/>
-        <w:ind w:left="180" w:hanging="180"/>
+        <w:spacing w:after="16" w:before="16" w:line="260"/>
+        <w:ind w:left="160" w:hanging="160"/>
       </w:pPr>
       <w:r>
         <w:rPr>
           <w:rFonts w:ascii="Calibri" w:eastAsia="Microsoft YaHei"/>
           <w:color w:val="2A6496"/>
-          <w:sz w:val="19"/>
-          <w:szCs w:val="19"/>
+          <w:sz w:val="17"/>
+          <w:szCs w:val="17"/>
         </w:rPr>
         <w:t xml:space="preserve">•</w:t>
       </w:r>
@@ -607,23 +607,23 @@
         <w:rPr>
           <w:rFonts w:ascii="Calibri" w:eastAsia="Microsoft YaHei"/>
           <w:color w:val="333333"/>
-          <w:sz w:val="19"/>
-          <w:szCs w:val="19"/>
+          <w:sz w:val="17"/>
+          <w:szCs w:val="17"/>
         </w:rPr>
         <w:t xml:space="preserve">  Resolved conflicting priorities between Risk and Sales departments by presenting SQL-based data analysis (conversion funnel metrics) to both stakeholders, facilitating agreement on a unified partner onboarding workflow</w:t>
       </w:r>
     </w:p>
     <w:p>
       <w:pPr>
-        <w:spacing w:after="30" w:before="30" w:line="276"/>
-        <w:ind w:left="180" w:hanging="180"/>
+        <w:spacing w:after="16" w:before="16" w:line="260"/>
+        <w:ind w:left="160" w:hanging="160"/>
       </w:pPr>
       <w:r>
         <w:rPr>
           <w:rFonts w:ascii="Calibri" w:eastAsia="Microsoft YaHei"/>
           <w:color w:val="2A6496"/>
-          <w:sz w:val="19"/>
-          <w:szCs w:val="19"/>
+          <w:sz w:val="17"/>
+          <w:szCs w:val="17"/>
         </w:rPr>
         <w:t xml:space="preserve">•</w:t>
       </w:r>
@@ -631,18 +631,42 @@
         <w:rPr>
           <w:rFonts w:ascii="Calibri" w:eastAsia="Microsoft YaHei"/>
           <w:color w:val="333333"/>
-          <w:sz w:val="19"/>
-          <w:szCs w:val="19"/>
-        </w:rPr>
-        <w:t xml:space="preserve">  Managed PayTabs and payment provider integrations by creating REST API specifications, building Postman test collections for end-to-end validation, and coordinating cross-team testing with QA and vendor technical leads</w:t>
+          <w:sz w:val="17"/>
+          <w:szCs w:val="17"/>
+        </w:rPr>
+        <w:t xml:space="preserve">  Managed multiple third-party integrations including PayTabs payment processing and a new sales channel within the loan management system, conducting stakeholder sessions with vendors and internal teams to define API specifications and data mapping, and coordinating end-to-end delivery through UAT sign-off</w:t>
+      </w:r>
+    </w:p>
+    <w:p>
+      <w:pPr>
+        <w:spacing w:after="16" w:before="16" w:line="260"/>
+        <w:ind w:left="160" w:hanging="160"/>
+      </w:pPr>
+      <w:r>
+        <w:rPr>
+          <w:rFonts w:ascii="Calibri" w:eastAsia="Microsoft YaHei"/>
+          <w:color w:val="2A6496"/>
+          <w:sz w:val="17"/>
+          <w:szCs w:val="17"/>
+        </w:rPr>
+        <w:t xml:space="preserve">•</w:t>
+      </w:r>
+      <w:r>
+        <w:rPr>
+          <w:rFonts w:ascii="Calibri" w:eastAsia="Microsoft YaHei"/>
+          <w:color w:val="333333"/>
+          <w:sz w:val="17"/>
+          <w:szCs w:val="17"/>
+        </w:rPr>
+        <w:t xml:space="preserve">  Led the digitization of goods loan delivery monitoring for the risk department by conducting stakeholder sessions to map manual tracking workflows to an automated web-oriented dashboard, and defining API specifications for SIMA e-signature and SMS provider integrations, coordinating end-to-end delivery through UAT sign-off</w:t>
       </w:r>
     </w:p>
     <w:p>
       <w:pPr>
         <w:tabs>
-          <w:tab w:val="right" w:pos="9506"/>
+          <w:tab w:val="right" w:pos="9906"/>
         </w:tabs>
-        <w:spacing w:after="20" w:before="140" w:line="276"/>
+        <w:spacing w:after="16" w:before="120" w:line="260"/>
       </w:pPr>
       <w:r>
         <w:rPr>
@@ -650,8 +674,8 @@
           <w:b/>
           <w:bCs/>
           <w:color w:val="1A1A1A"/>
-          <w:sz w:val="21"/>
-          <w:szCs w:val="21"/>
+          <w:sz w:val="20"/>
+          <w:szCs w:val="20"/>
         </w:rPr>
         <w:t xml:space="preserve">BirMarket (Umico)</w:t>
       </w:r>
@@ -659,8 +683,8 @@
         <w:rPr>
           <w:rFonts w:ascii="Calibri" w:eastAsia="Microsoft YaHei"/>
           <w:color w:val="777777"/>
-          <w:sz w:val="19"/>
-          <w:szCs w:val="19"/>
+          <w:sz w:val="18"/>
+          <w:szCs w:val="18"/>
         </w:rPr>
         <w:t xml:space="preserve">  |  </w:t>
       </w:r>
@@ -670,8 +694,8 @@
           <w:i/>
           <w:iCs/>
           <w:color w:val="333333"/>
-          <w:sz w:val="19"/>
-          <w:szCs w:val="19"/>
+          <w:sz w:val="18"/>
+          <w:szCs w:val="18"/>
         </w:rPr>
         <w:t xml:space="preserve">Business Analyst</w:t>
       </w:r>
@@ -685,23 +709,23 @@
         <w:rPr>
           <w:rFonts w:ascii="Calibri" w:eastAsia="Microsoft YaHei"/>
           <w:color w:val="777777"/>
-          <w:sz w:val="17"/>
-          <w:szCs w:val="17"/>
+          <w:sz w:val="16"/>
+          <w:szCs w:val="16"/>
         </w:rPr>
         <w:t xml:space="preserve">2022 – 2025</w:t>
       </w:r>
     </w:p>
     <w:p>
       <w:pPr>
-        <w:spacing w:after="30" w:before="30" w:line="276"/>
-        <w:ind w:left="180" w:hanging="180"/>
+        <w:spacing w:after="16" w:before="16" w:line="260"/>
+        <w:ind w:left="160" w:hanging="160"/>
       </w:pPr>
       <w:r>
         <w:rPr>
           <w:rFonts w:ascii="Calibri" w:eastAsia="Microsoft YaHei"/>
           <w:color w:val="2A6496"/>
-          <w:sz w:val="19"/>
-          <w:szCs w:val="19"/>
+          <w:sz w:val="17"/>
+          <w:szCs w:val="17"/>
         </w:rPr>
         <w:t xml:space="preserve">•</w:t>
       </w:r>
@@ -709,23 +733,23 @@
         <w:rPr>
           <w:rFonts w:ascii="Calibri" w:eastAsia="Microsoft YaHei"/>
           <w:color w:val="333333"/>
-          <w:sz w:val="19"/>
-          <w:szCs w:val="19"/>
+          <w:sz w:val="17"/>
+          <w:szCs w:val="17"/>
         </w:rPr>
         <w:t xml:space="preserve">  Designed and documented the end-to-end seller onboarding process from scratch, conducting stakeholder interviews with operations, logistics, and warehouse teams to capture all edge cases and define measurable Acceptance Criteria</w:t>
       </w:r>
     </w:p>
     <w:p>
       <w:pPr>
-        <w:spacing w:after="30" w:before="30" w:line="276"/>
-        <w:ind w:left="180" w:hanging="180"/>
+        <w:spacing w:after="16" w:before="16" w:line="260"/>
+        <w:ind w:left="160" w:hanging="160"/>
       </w:pPr>
       <w:r>
         <w:rPr>
           <w:rFonts w:ascii="Calibri" w:eastAsia="Microsoft YaHei"/>
           <w:color w:val="2A6496"/>
-          <w:sz w:val="19"/>
-          <w:szCs w:val="19"/>
+          <w:sz w:val="17"/>
+          <w:szCs w:val="17"/>
         </w:rPr>
         <w:t xml:space="preserve">•</w:t>
       </w:r>
@@ -733,23 +757,23 @@
         <w:rPr>
           <w:rFonts w:ascii="Calibri" w:eastAsia="Microsoft YaHei"/>
           <w:color w:val="333333"/>
-          <w:sz w:val="19"/>
-          <w:szCs w:val="19"/>
+          <w:sz w:val="17"/>
+          <w:szCs w:val="17"/>
         </w:rPr>
         <w:t xml:space="preserve">  Analyzed seller performance and inventory data using SQL queries (complex JOINs, GROUP BY aggregations), identified fulfillment bottlenecks, and presented prioritized improvement recommendations to the product team with supporting data</w:t>
       </w:r>
     </w:p>
     <w:p>
       <w:pPr>
-        <w:spacing w:after="30" w:before="30" w:line="276"/>
-        <w:ind w:left="180" w:hanging="180"/>
+        <w:spacing w:after="16" w:before="16" w:line="260"/>
+        <w:ind w:left="160" w:hanging="160"/>
       </w:pPr>
       <w:r>
         <w:rPr>
           <w:rFonts w:ascii="Calibri" w:eastAsia="Microsoft YaHei"/>
           <w:color w:val="2A6496"/>
-          <w:sz w:val="19"/>
-          <w:szCs w:val="19"/>
+          <w:sz w:val="17"/>
+          <w:szCs w:val="17"/>
         </w:rPr>
         <w:t xml:space="preserve">•</w:t>
       </w:r>
@@ -757,39 +781,15 @@
         <w:rPr>
           <w:rFonts w:ascii="Calibri" w:eastAsia="Microsoft YaHei"/>
           <w:color w:val="333333"/>
-          <w:sz w:val="19"/>
-          <w:szCs w:val="19"/>
+          <w:sz w:val="17"/>
+          <w:szCs w:val="17"/>
         </w:rPr>
         <w:t xml:space="preserve">  Collaborated with marketing and product teams on CMS-driven content changes and promotional campaigns, ensuring business copy requirements were accurately documented and delivered within sprint cycles without scope creep</w:t>
       </w:r>
     </w:p>
     <w:p>
       <w:pPr>
-        <w:spacing w:after="30" w:before="30" w:line="276"/>
-        <w:ind w:left="180" w:hanging="180"/>
-      </w:pPr>
-      <w:r>
-        <w:rPr>
-          <w:rFonts w:ascii="Calibri" w:eastAsia="Microsoft YaHei"/>
-          <w:color w:val="2A6496"/>
-          <w:sz w:val="19"/>
-          <w:szCs w:val="19"/>
-        </w:rPr>
-        <w:t xml:space="preserve">•</w:t>
-      </w:r>
-      <w:r>
-        <w:rPr>
-          <w:rFonts w:ascii="Calibri" w:eastAsia="Microsoft YaHei"/>
-          <w:color w:val="333333"/>
-          <w:sz w:val="19"/>
-          <w:szCs w:val="19"/>
-        </w:rPr>
-        <w:t xml:space="preserve">  Provided L2 production support during critical marketplace incidents by analyzing ELK Stack system logs, identifying root causes at the code level, and coordinating rapid resolution with the development team</w:t>
-      </w:r>
-    </w:p>
-    <w:p>
-      <w:pPr>
-        <w:spacing w:after="0" w:before="100"/>
+        <w:spacing w:after="0" w:before="50"/>
       </w:pPr>
     </w:p>
     <w:tbl>
@@ -805,11 +805,11 @@
         </w:tblBorders>
       </w:tblPr>
       <w:tblGrid>
-        <w:gridCol w:w="9506"/>
+        <w:gridCol w:w="9906"/>
       </w:tblGrid>
       <w:tr>
         <w:trPr>
-          <w:trHeight w:val="350" w:hRule="exact"/>
+          <w:trHeight w:val="320" w:hRule="exact"/>
         </w:trPr>
         <w:tc>
           <w:tcPr>
@@ -824,7 +824,7 @@
           </w:tcPr>
           <w:p>
             <w:pPr>
-              <w:spacing w:after="40" w:before="80"/>
+              <w:spacing w:after="30" w:before="60"/>
             </w:pPr>
             <w:r>
               <w:rPr>
@@ -833,8 +833,8 @@
                 <w:bCs/>
                 <w:color w:val="2A6496"/>
                 <w:spacing w:val="80"/>
-                <w:sz w:val="20"/>
-                <w:szCs w:val="20"/>
+                <w:sz w:val="19"/>
+                <w:szCs w:val="19"/>
               </w:rPr>
               <w:t xml:space="preserve">TECHNICAL FOUNDATION</w:t>
             </w:r>
@@ -844,27 +844,27 @@
     </w:tbl>
     <w:p>
       <w:pPr>
-        <w:spacing w:after="0" w:before="60"/>
-      </w:pPr>
-    </w:p>
-    <w:p>
-      <w:pPr>
-        <w:spacing w:after="20" w:before="20" w:line="276"/>
+        <w:spacing w:after="0" w:before="30"/>
+      </w:pPr>
+    </w:p>
+    <w:p>
+      <w:pPr>
+        <w:spacing w:after="16" w:before="16" w:line="260"/>
         <w:jc w:val="both"/>
       </w:pPr>
       <w:r>
         <w:rPr>
           <w:rFonts w:ascii="Calibri" w:eastAsia="Microsoft YaHei"/>
           <w:color w:val="333333"/>
-          <w:sz w:val="19"/>
-          <w:szCs w:val="19"/>
-        </w:rPr>
-        <w:t xml:space="preserve">15+ years in software engineering (Central Bank of Azerbaijan, Unibank, ASAN Service) covering backend development (C#, T-SQL), database architecture (Oracle, MSSQL, PostgreSQL), and system integration. This technical background enables precise requirement-to-code translation, efficient developer communication, and rapid root cause analysis during production incidents.</w:t>
-      </w:r>
-    </w:p>
-    <w:p>
-      <w:pPr>
-        <w:spacing w:after="0" w:before="100"/>
+          <w:sz w:val="18"/>
+          <w:szCs w:val="18"/>
+        </w:rPr>
+        <w:t xml:space="preserve">15+ years in software engineering (Central Bank of Azerbaijan, Unibank, ASAN Service) covering backend development (C#, T-SQL), database architecture (Oracle, MSSQL, PostgreSQL), and system integration. Enables precise requirement-to-code translation and rapid root cause analysis during production incidents.</w:t>
+      </w:r>
+    </w:p>
+    <w:p>
+      <w:pPr>
+        <w:spacing w:after="0" w:before="50"/>
       </w:pPr>
     </w:p>
     <w:tbl>
@@ -880,11 +880,11 @@
         </w:tblBorders>
       </w:tblPr>
       <w:tblGrid>
-        <w:gridCol w:w="9506"/>
+        <w:gridCol w:w="9906"/>
       </w:tblGrid>
       <w:tr>
         <w:trPr>
-          <w:trHeight w:val="350" w:hRule="exact"/>
+          <w:trHeight w:val="320" w:hRule="exact"/>
         </w:trPr>
         <w:tc>
           <w:tcPr>
@@ -899,7 +899,7 @@
           </w:tcPr>
           <w:p>
             <w:pPr>
-              <w:spacing w:after="40" w:before="80"/>
+              <w:spacing w:after="30" w:before="60"/>
             </w:pPr>
             <w:r>
               <w:rPr>
@@ -908,8 +908,8 @@
                 <w:bCs/>
                 <w:color w:val="2A6496"/>
                 <w:spacing w:val="80"/>
-                <w:sz w:val="20"/>
-                <w:szCs w:val="20"/>
+                <w:sz w:val="19"/>
+                <w:szCs w:val="19"/>
               </w:rPr>
               <w:t xml:space="preserve">EDUCATION</w:t>
             </w:r>
@@ -919,12 +919,12 @@
     </w:tbl>
     <w:p>
       <w:pPr>
-        <w:spacing w:after="0" w:before="60"/>
-      </w:pPr>
-    </w:p>
-    <w:p>
-      <w:pPr>
-        <w:spacing w:after="20" w:before="20" w:line="276"/>
+        <w:spacing w:after="0" w:before="30"/>
+      </w:pPr>
+    </w:p>
+    <w:p>
+      <w:pPr>
+        <w:spacing w:after="16" w:before="16" w:line="260"/>
       </w:pPr>
       <w:r>
         <w:rPr>
@@ -932,33 +932,33 @@
           <w:b/>
           <w:bCs/>
           <w:color w:val="1A1A1A"/>
-          <w:sz w:val="20"/>
-          <w:szCs w:val="20"/>
-        </w:rPr>
-        <w:t xml:space="preserve">Baku State University</w:t>
-      </w:r>
-      <w:r>
-        <w:rPr>
-          <w:rFonts w:ascii="Calibri" w:eastAsia="Microsoft YaHei"/>
-          <w:color w:val="777777"/>
           <w:sz w:val="19"/>
           <w:szCs w:val="19"/>
         </w:rPr>
+        <w:t xml:space="preserve">Baku State University</w:t>
+      </w:r>
+      <w:r>
+        <w:rPr>
+          <w:rFonts w:ascii="Calibri" w:eastAsia="Microsoft YaHei"/>
+          <w:color w:val="777777"/>
+          <w:sz w:val="18"/>
+          <w:szCs w:val="18"/>
+        </w:rPr>
         <w:t xml:space="preserve">  —  </w:t>
       </w:r>
       <w:r>
         <w:rPr>
           <w:rFonts w:ascii="Calibri" w:eastAsia="Microsoft YaHei"/>
           <w:color w:val="333333"/>
-          <w:sz w:val="19"/>
-          <w:szCs w:val="19"/>
+          <w:sz w:val="18"/>
+          <w:szCs w:val="18"/>
         </w:rPr>
         <w:t xml:space="preserve">Bachelor of Science in Applied Mathematics</w:t>
       </w:r>
     </w:p>
     <w:sectPr>
       <w:pgSz w:w="11906" w:h="16838" w:orient="portrait"/>
-      <w:pgMar w:top="700" w:right="1200" w:bottom="600" w:left="1200" w:header="708" w:footer="708" w:gutter="0"/>
+      <w:pgMar w:top="550" w:right="950" w:bottom="450" w:left="950" w:header="708" w:footer="708" w:gutter="0"/>
       <w:pgNumType/>
       <w:docGrid w:linePitch="360"/>
     </w:sectPr>
@@ -1146,13 +1146,13 @@
       <w:rPr>
         <w:rFonts w:ascii="Calibri" w:eastAsia="Microsoft YaHei"/>
         <w:color w:val="333333"/>
-        <w:sz w:val="19"/>
-        <w:szCs w:val="19"/>
+        <w:sz w:val="18"/>
+        <w:szCs w:val="18"/>
       </w:rPr>
     </w:rPrDefault>
     <w:pPrDefault>
       <w:pPr>
-        <w:spacing w:line="276"/>
+        <w:spacing w:line="260"/>
       </w:pPr>
     </w:pPrDefault>
   </w:docDefaults>

</xml_diff>

<commit_message>
Update CV: two-layer Projects + Methodology structure for Embafinans
</commit_message>
<xml_diff>
--- a/Zamir_Camalov_BA_CV_EN.docx
+++ b/Zamir_Camalov_BA_CV_EN.docx
@@ -519,6 +519,184 @@
     </w:p>
     <w:p>
       <w:pPr>
+        <w:spacing w:after="20" w:before="100" w:line="260"/>
+      </w:pPr>
+      <w:r>
+        <w:rPr>
+          <w:rFonts w:ascii="Calibri" w:eastAsia="Microsoft YaHei"/>
+          <w:b/>
+          <w:bCs/>
+          <w:i/>
+          <w:iCs/>
+          <w:color w:val="1A1A1A"/>
+          <w:spacing w:val="40"/>
+          <w:sz w:val="18"/>
+          <w:szCs w:val="18"/>
+        </w:rPr>
+        <w:t xml:space="preserve">Projects Delivered</w:t>
+      </w:r>
+    </w:p>
+    <w:p>
+      <w:pPr>
+        <w:spacing w:after="10" w:before="10" w:line="250"/>
+        <w:ind w:left="200" w:hanging="200"/>
+      </w:pPr>
+      <w:r>
+        <w:rPr>
+          <w:rFonts w:ascii="Calibri" w:eastAsia="Microsoft YaHei"/>
+          <w:color w:val="2A6496"/>
+          <w:sz w:val="17"/>
+          <w:szCs w:val="17"/>
+        </w:rPr>
+        <w:t xml:space="preserve">•</w:t>
+      </w:r>
+      <w:r>
+        <w:rPr>
+          <w:rFonts w:ascii="Calibri" w:eastAsia="Microsoft YaHei"/>
+          <w:b/>
+          <w:bCs/>
+          <w:color w:val="1A1A1A"/>
+          <w:sz w:val="17"/>
+          <w:szCs w:val="17"/>
+        </w:rPr>
+        <w:t xml:space="preserve">  BNPL Credit Scoring &amp; Pre-Screen Risk Assessment  </w:t>
+      </w:r>
+      <w:r>
+        <w:rPr>
+          <w:rFonts w:ascii="Calibri" w:eastAsia="Microsoft YaHei"/>
+          <w:color w:val="777777"/>
+          <w:sz w:val="16"/>
+          <w:szCs w:val="16"/>
+        </w:rPr>
+        <w:t xml:space="preserve">(AKB, ASANfinance, BPMN)</w:t>
+      </w:r>
+    </w:p>
+    <w:p>
+      <w:pPr>
+        <w:spacing w:after="10" w:before="10" w:line="250"/>
+        <w:ind w:left="200" w:hanging="200"/>
+      </w:pPr>
+      <w:r>
+        <w:rPr>
+          <w:rFonts w:ascii="Calibri" w:eastAsia="Microsoft YaHei"/>
+          <w:color w:val="2A6496"/>
+          <w:sz w:val="17"/>
+          <w:szCs w:val="17"/>
+        </w:rPr>
+        <w:t xml:space="preserve">•</w:t>
+      </w:r>
+      <w:r>
+        <w:rPr>
+          <w:rFonts w:ascii="Calibri" w:eastAsia="Microsoft YaHei"/>
+          <w:b/>
+          <w:bCs/>
+          <w:color w:val="1A1A1A"/>
+          <w:sz w:val="17"/>
+          <w:szCs w:val="17"/>
+        </w:rPr>
+        <w:t xml:space="preserve">  Sales Channel &amp; Payment Integration  </w:t>
+      </w:r>
+      <w:r>
+        <w:rPr>
+          <w:rFonts w:ascii="Calibri" w:eastAsia="Microsoft YaHei"/>
+          <w:color w:val="777777"/>
+          <w:sz w:val="16"/>
+          <w:szCs w:val="16"/>
+        </w:rPr>
+        <w:t xml:space="preserve">(3rd-Party Credit Applications, PayTabs)</w:t>
+      </w:r>
+    </w:p>
+    <w:p>
+      <w:pPr>
+        <w:spacing w:after="10" w:before="10" w:line="250"/>
+        <w:ind w:left="200" w:hanging="200"/>
+      </w:pPr>
+      <w:r>
+        <w:rPr>
+          <w:rFonts w:ascii="Calibri" w:eastAsia="Microsoft YaHei"/>
+          <w:color w:val="2A6496"/>
+          <w:sz w:val="17"/>
+          <w:szCs w:val="17"/>
+        </w:rPr>
+        <w:t xml:space="preserve">•</w:t>
+      </w:r>
+      <w:r>
+        <w:rPr>
+          <w:rFonts w:ascii="Calibri" w:eastAsia="Microsoft YaHei"/>
+          <w:b/>
+          <w:bCs/>
+          <w:color w:val="1A1A1A"/>
+          <w:sz w:val="17"/>
+          <w:szCs w:val="17"/>
+        </w:rPr>
+        <w:t xml:space="preserve">  Goods Loan Delivery Dashboard  </w:t>
+      </w:r>
+      <w:r>
+        <w:rPr>
+          <w:rFonts w:ascii="Calibri" w:eastAsia="Microsoft YaHei"/>
+          <w:color w:val="777777"/>
+          <w:sz w:val="16"/>
+          <w:szCs w:val="16"/>
+        </w:rPr>
+        <w:t xml:space="preserve">(Risk Monitoring, SIMA e-Signature, SMS)</w:t>
+      </w:r>
+    </w:p>
+    <w:p>
+      <w:pPr>
+        <w:spacing w:after="10" w:before="10" w:line="250"/>
+        <w:ind w:left="200" w:hanging="200"/>
+      </w:pPr>
+      <w:r>
+        <w:rPr>
+          <w:rFonts w:ascii="Calibri" w:eastAsia="Microsoft YaHei"/>
+          <w:color w:val="2A6496"/>
+          <w:sz w:val="17"/>
+          <w:szCs w:val="17"/>
+        </w:rPr>
+        <w:t xml:space="preserve">•</w:t>
+      </w:r>
+      <w:r>
+        <w:rPr>
+          <w:rFonts w:ascii="Calibri" w:eastAsia="Microsoft YaHei"/>
+          <w:b/>
+          <w:bCs/>
+          <w:color w:val="1A1A1A"/>
+          <w:sz w:val="17"/>
+          <w:szCs w:val="17"/>
+        </w:rPr>
+        <w:t xml:space="preserve">  Partner Onboarding &amp; Application Management  </w:t>
+      </w:r>
+      <w:r>
+        <w:rPr>
+          <w:rFonts w:ascii="Calibri" w:eastAsia="Microsoft YaHei"/>
+          <w:color w:val="777777"/>
+          <w:sz w:val="16"/>
+          <w:szCs w:val="16"/>
+        </w:rPr>
+        <w:t xml:space="preserve">(FRD, 8+ REST API Endpoints)</w:t>
+      </w:r>
+    </w:p>
+    <w:p>
+      <w:pPr>
+        <w:spacing w:after="20" w:before="100" w:line="260"/>
+      </w:pPr>
+      <w:r>
+        <w:rPr>
+          <w:rFonts w:ascii="Calibri" w:eastAsia="Microsoft YaHei"/>
+          <w:b/>
+          <w:bCs/>
+          <w:i/>
+          <w:iCs/>
+          <w:color w:val="1A1A1A"/>
+          <w:spacing w:val="40"/>
+          <w:sz w:val="18"/>
+          <w:szCs w:val="18"/>
+        </w:rPr>
+        <w:t xml:space="preserve">Delivery Methodology</w:t>
+      </w:r>
+    </w:p>
+    <w:p>
+      <w:pPr>
         <w:spacing w:after="16" w:before="16" w:line="260"/>
         <w:ind w:left="160" w:hanging="160"/>
       </w:pPr>
@@ -538,7 +716,7 @@
           <w:sz w:val="17"/>
           <w:szCs w:val="17"/>
         </w:rPr>
-        <w:t xml:space="preserve">  Conducted structured discovery sessions with risk teams to map the As-Is BNPL credit scoring workflow, designed a pre-screen scoring model by integrating external data sources (AKB, ASANfinance) for multi-factor risk assessment, and created To-Be BPMN process models with exclusive gateways — reducing credit decision time by 50%</w:t>
+        <w:t xml:space="preserve">  Conducted structured discovery sessions with risk, sales, and operations stakeholders to map As-Is workflows, design To-Be BPMN process models, and align on scope</w:t>
       </w:r>
     </w:p>
     <w:p>
@@ -562,7 +740,7 @@
           <w:sz w:val="17"/>
           <w:szCs w:val="17"/>
         </w:rPr>
-        <w:t xml:space="preserve">  Authored detailed FRDs with numbered requirements (REQ-101 format) and designed REST API specifications with Swagger/OpenAPI 3.0 documentation for 8+ endpoints covering partner onboarding, application management, and payment processing — ensuring zero-ambiguity handoff to the development team</w:t>
+        <w:t xml:space="preserve">  Authored detailed FRDs with numbered requirements (REQ-101 format) and designed REST API specifications using Swagger/OpenAPI 3.0 for seamless handoff to development teams</w:t>
       </w:r>
     </w:p>
     <w:p>
@@ -586,7 +764,7 @@
           <w:sz w:val="17"/>
           <w:szCs w:val="17"/>
         </w:rPr>
-        <w:t xml:space="preserve">  Wrote User Stories with Given/When/Then Acceptance Criteria in Jira/Confluence, coordinated UAT execution with business stakeholders, and led bug triage meetings with QA and developers — achieving on-time sign-off for 3 release cycles</w:t>
+        <w:t xml:space="preserve">  Wrote User Stories with Gherkin Acceptance Criteria, coordinated UAT execution, and led bug triage meetings — achieving on-time sign-off across multiple release cycles</w:t>
       </w:r>
     </w:p>
     <w:p>
@@ -610,55 +788,7 @@
           <w:sz w:val="17"/>
           <w:szCs w:val="17"/>
         </w:rPr>
-        <w:t xml:space="preserve">  Resolved conflicting priorities between Risk and Sales departments by presenting SQL-based data analysis (conversion funnel metrics) to both stakeholders, facilitating agreement on a unified partner onboarding workflow</w:t>
-      </w:r>
-    </w:p>
-    <w:p>
-      <w:pPr>
-        <w:spacing w:after="16" w:before="16" w:line="260"/>
-        <w:ind w:left="160" w:hanging="160"/>
-      </w:pPr>
-      <w:r>
-        <w:rPr>
-          <w:rFonts w:ascii="Calibri" w:eastAsia="Microsoft YaHei"/>
-          <w:color w:val="2A6496"/>
-          <w:sz w:val="17"/>
-          <w:szCs w:val="17"/>
-        </w:rPr>
-        <w:t xml:space="preserve">•</w:t>
-      </w:r>
-      <w:r>
-        <w:rPr>
-          <w:rFonts w:ascii="Calibri" w:eastAsia="Microsoft YaHei"/>
-          <w:color w:val="333333"/>
-          <w:sz w:val="17"/>
-          <w:szCs w:val="17"/>
-        </w:rPr>
-        <w:t xml:space="preserve">  Managed multiple third-party integrations including PayTabs payment processing and a new sales channel within the loan management system, conducting stakeholder sessions with vendors and internal teams to define API specifications and data mapping, and coordinating end-to-end delivery through UAT sign-off</w:t>
-      </w:r>
-    </w:p>
-    <w:p>
-      <w:pPr>
-        <w:spacing w:after="16" w:before="16" w:line="260"/>
-        <w:ind w:left="160" w:hanging="160"/>
-      </w:pPr>
-      <w:r>
-        <w:rPr>
-          <w:rFonts w:ascii="Calibri" w:eastAsia="Microsoft YaHei"/>
-          <w:color w:val="2A6496"/>
-          <w:sz w:val="17"/>
-          <w:szCs w:val="17"/>
-        </w:rPr>
-        <w:t xml:space="preserve">•</w:t>
-      </w:r>
-      <w:r>
-        <w:rPr>
-          <w:rFonts w:ascii="Calibri" w:eastAsia="Microsoft YaHei"/>
-          <w:color w:val="333333"/>
-          <w:sz w:val="17"/>
-          <w:szCs w:val="17"/>
-        </w:rPr>
-        <w:t xml:space="preserve">  Led the digitization of goods loan delivery monitoring for the risk department by conducting stakeholder sessions to map manual tracking workflows to an automated web-oriented dashboard, and defining API specifications for SIMA e-signature and SMS provider integrations, coordinating end-to-end delivery through UAT sign-off</w:t>
+        <w:t xml:space="preserve">  Leveraged SQL data analysis to resolve conflicting stakeholder priorities, presenting evidence-based recommendations to drive consensus</w:t>
       </w:r>
     </w:p>
     <w:p>

</xml_diff>

<commit_message>
Simplify project keywords for universal clarity
</commit_message>
<xml_diff>
--- a/Zamir_Camalov_BA_CV_EN.docx
+++ b/Zamir_Camalov_BA_CV_EN.docx
@@ -568,7 +568,7 @@
           <w:sz w:val="16"/>
           <w:szCs w:val="16"/>
         </w:rPr>
-        <w:t xml:space="preserve">(AKB, ASANfinance, BPMN)</w:t>
+        <w:t xml:space="preserve">(Credit Bureau &amp; Financial Data Integration, Process Modeling)</w:t>
       </w:r>
     </w:p>
     <w:p>
@@ -594,7 +594,7 @@
           <w:sz w:val="17"/>
           <w:szCs w:val="17"/>
         </w:rPr>
-        <w:t xml:space="preserve">  Sales Channel &amp; Payment Integration  </w:t>
+        <w:t xml:space="preserve">  Sales Channel &amp; Payment Gateway Integration  </w:t>
       </w:r>
       <w:r>
         <w:rPr>
@@ -603,7 +603,7 @@
           <w:sz w:val="16"/>
           <w:szCs w:val="16"/>
         </w:rPr>
-        <w:t xml:space="preserve">(3rd-Party Credit Applications, PayTabs)</w:t>
+        <w:t xml:space="preserve">(External Loan Applications, Online Payment Processing)</w:t>
       </w:r>
     </w:p>
     <w:p>
@@ -629,7 +629,7 @@
           <w:sz w:val="17"/>
           <w:szCs w:val="17"/>
         </w:rPr>
-        <w:t xml:space="preserve">  Goods Loan Delivery Dashboard  </w:t>
+        <w:t xml:space="preserve">  Goods Loan Delivery Tracking Dashboard  </w:t>
       </w:r>
       <w:r>
         <w:rPr>
@@ -638,7 +638,7 @@
           <w:sz w:val="16"/>
           <w:szCs w:val="16"/>
         </w:rPr>
-        <w:t xml:space="preserve">(Risk Monitoring, SIMA e-Signature, SMS)</w:t>
+        <w:t xml:space="preserve">(Loan Portfolio Monitoring, Digital E-Signature, SMS Notifications)</w:t>
       </w:r>
     </w:p>
     <w:p>
@@ -664,7 +664,7 @@
           <w:sz w:val="17"/>
           <w:szCs w:val="17"/>
         </w:rPr>
-        <w:t xml:space="preserve">  Partner Onboarding &amp; Application Management  </w:t>
+        <w:t xml:space="preserve">  Partner Onboarding &amp; Loan Application Management  </w:t>
       </w:r>
       <w:r>
         <w:rPr>
@@ -673,7 +673,7 @@
           <w:sz w:val="16"/>
           <w:szCs w:val="16"/>
         </w:rPr>
-        <w:t xml:space="preserve">(FRD, 8+ REST API Endpoints)</w:t>
+        <w:t xml:space="preserve">(Full Requirements Documentation, 8+ REST API Endpoints)</w:t>
       </w:r>
     </w:p>
     <w:p>

</xml_diff>

<commit_message>
Rebalance project keywords - remove skill-specific from projects, keep in methodology
</commit_message>
<xml_diff>
--- a/Zamir_Camalov_BA_CV_EN.docx
+++ b/Zamir_Camalov_BA_CV_EN.docx
@@ -568,7 +568,7 @@
           <w:sz w:val="16"/>
           <w:szCs w:val="16"/>
         </w:rPr>
-        <w:t xml:space="preserve">(Credit Bureau &amp; Financial Data Integration, Process Modeling)</w:t>
+        <w:t xml:space="preserve">(Automated Decision Engine, External Data Integration)</w:t>
       </w:r>
     </w:p>
     <w:p>
@@ -603,7 +603,7 @@
           <w:sz w:val="16"/>
           <w:szCs w:val="16"/>
         </w:rPr>
-        <w:t xml:space="preserve">(External Loan Applications, Online Payment Processing)</w:t>
+        <w:t xml:space="preserve">(Multi-Channel Loan Processing, Online Payments)</w:t>
       </w:r>
     </w:p>
     <w:p>
@@ -638,7 +638,7 @@
           <w:sz w:val="16"/>
           <w:szCs w:val="16"/>
         </w:rPr>
-        <w:t xml:space="preserve">(Loan Portfolio Monitoring, Digital E-Signature, SMS Notifications)</w:t>
+        <w:t xml:space="preserve">(Web Dashboard, Digital Signatures, Automated Notifications)</w:t>
       </w:r>
     </w:p>
     <w:p>
@@ -673,7 +673,7 @@
           <w:sz w:val="16"/>
           <w:szCs w:val="16"/>
         </w:rPr>
-        <w:t xml:space="preserve">(Requirements Documentation, REST API Design)</w:t>
+        <w:t xml:space="preserve">(End-to-End Workflow, Full Documentation)</w:t>
       </w:r>
     </w:p>
     <w:p>

</xml_diff>

<commit_message>
Restructure methodology to 5-step BA lifecycle with clear labels
</commit_message>
<xml_diff>
--- a/Zamir_Camalov_BA_CV_EN.docx
+++ b/Zamir_Camalov_BA_CV_EN.docx
@@ -716,7 +716,7 @@
           <w:sz w:val="17"/>
           <w:szCs w:val="17"/>
         </w:rPr>
-        <w:t xml:space="preserve">  Conducted structured discovery sessions with risk, sales, and operations stakeholders to map As-Is workflows, design To-Be BPMN process models, and align on scope</w:t>
+        <w:t xml:space="preserve">  Discovery &amp; Process Modeling: Conducted structured stakeholder sessions with risk, sales, and operations teams to map As-Is workflows, identify pain points, and design To-Be BPMN process models</w:t>
       </w:r>
     </w:p>
     <w:p>
@@ -740,7 +740,7 @@
           <w:sz w:val="17"/>
           <w:szCs w:val="17"/>
         </w:rPr>
-        <w:t xml:space="preserve">  Authored detailed FRDs with numbered requirements (REQ-101 format) and designed REST API specifications using Swagger/OpenAPI 3.0 for seamless handoff to development teams</w:t>
+        <w:t xml:space="preserve">  Requirements Documentation: Authored detailed FRDs with numbered requirements (REQ-101 format), wrote User Stories with Gherkin Acceptance Criteria, and maintained traceability across sprints</w:t>
       </w:r>
     </w:p>
     <w:p>
@@ -764,7 +764,7 @@
           <w:sz w:val="17"/>
           <w:szCs w:val="17"/>
         </w:rPr>
-        <w:t xml:space="preserve">  Wrote User Stories with Gherkin Acceptance Criteria, coordinated UAT execution, and led bug triage meetings — achieving on-time sign-off across multiple release cycles</w:t>
+        <w:t xml:space="preserve">  Technical Specification: Defined REST API specifications using Swagger/OpenAPI 3.0 and created data mapping documents for seamless handoff to development teams</w:t>
       </w:r>
     </w:p>
     <w:p>
@@ -788,7 +788,31 @@
           <w:sz w:val="17"/>
           <w:szCs w:val="17"/>
         </w:rPr>
-        <w:t xml:space="preserve">  Leveraged SQL data analysis to resolve conflicting stakeholder priorities, presenting evidence-based recommendations to drive consensus</w:t>
+        <w:t xml:space="preserve">  UAT &amp; Delivery Coordination: Coordinated UAT execution with business stakeholders, led bug triage meetings with QA and developers, and achieved on-time sign-off across multiple release cycles</w:t>
+      </w:r>
+    </w:p>
+    <w:p>
+      <w:pPr>
+        <w:spacing w:after="16" w:before="16" w:line="260"/>
+        <w:ind w:left="160" w:hanging="160"/>
+      </w:pPr>
+      <w:r>
+        <w:rPr>
+          <w:rFonts w:ascii="Calibri" w:eastAsia="Microsoft YaHei"/>
+          <w:color w:val="2A6496"/>
+          <w:sz w:val="17"/>
+          <w:szCs w:val="17"/>
+        </w:rPr>
+        <w:t xml:space="preserve">•</w:t>
+      </w:r>
+      <w:r>
+        <w:rPr>
+          <w:rFonts w:ascii="Calibri" w:eastAsia="Microsoft YaHei"/>
+          <w:color w:val="333333"/>
+          <w:sz w:val="17"/>
+          <w:szCs w:val="17"/>
+        </w:rPr>
+        <w:t xml:space="preserve">  Data-Driven Decision Making: Leveraged SQL data analysis to resolve conflicting stakeholder priorities, presenting evidence-based recommendations to drive consensus</w:t>
       </w:r>
     </w:p>
     <w:p>

</xml_diff>

<commit_message>
Add real metrics to project keywords (2x faster, B2C, 10+ users)
</commit_message>
<xml_diff>
--- a/Zamir_Camalov_BA_CV_EN.docx
+++ b/Zamir_Camalov_BA_CV_EN.docx
@@ -568,7 +568,7 @@
           <w:sz w:val="16"/>
           <w:szCs w:val="16"/>
         </w:rPr>
-        <w:t xml:space="preserve">(Automated Decision Engine, External Data Integration)</w:t>
+        <w:t xml:space="preserve">(2x Faster Credit Decisions, Automated Multi-Factor Assessment)</w:t>
       </w:r>
     </w:p>
     <w:p>
@@ -594,7 +594,7 @@
           <w:sz w:val="17"/>
           <w:szCs w:val="17"/>
         </w:rPr>
-        <w:t xml:space="preserve">  Sales Channel &amp; Payment Gateway Integration  </w:t>
+        <w:t xml:space="preserve">  B2C Sales Channel &amp; Payment Gateway Integration  </w:t>
       </w:r>
       <w:r>
         <w:rPr>
@@ -603,7 +603,7 @@
           <w:sz w:val="16"/>
           <w:szCs w:val="16"/>
         </w:rPr>
-        <w:t xml:space="preserve">(Multi-Channel Loan Processing, Online Payments)</w:t>
+        <w:t xml:space="preserve">(In-App Loan Applications, Online Payment Processing)</w:t>
       </w:r>
     </w:p>
     <w:p>
@@ -638,7 +638,7 @@
           <w:sz w:val="16"/>
           <w:szCs w:val="16"/>
         </w:rPr>
-        <w:t xml:space="preserve">(Web Dashboard, Digital Signatures, Automated Notifications)</w:t>
+        <w:t xml:space="preserve">(Real-Time Monitoring, 10+ Active Users, Digital E-Signature)</w:t>
       </w:r>
     </w:p>
     <w:p>

</xml_diff>

<commit_message>
Rewrite summary with business impact metrics (10 employees freed, 2x throughput, 300-500 daily apps)
</commit_message>
<xml_diff>
--- a/Zamir_Camalov_BA_CV_EN.docx
+++ b/Zamir_Camalov_BA_CV_EN.docx
@@ -208,7 +208,7 @@
           <w:sz w:val="18"/>
           <w:szCs w:val="18"/>
         </w:rPr>
-        <w:t xml:space="preserve">IT Business Analyst with 3+ years of experience in E-Commerce and Fintech, skilled in stakeholder discovery, BRD/FRD authoring, BPMN process modeling, REST API documentation (Swagger), SQL analytics, and end-to-end delivery coordination through UAT sign-off. Software engineering background enables precise technical translation of business requirements and efficient collaboration with development teams.</w:t>
+        <w:t xml:space="preserve">Business Analyst who transforms manual processes into automated systems — freed 10 employees from manual calls, doubled credit decision throughput, enabled 300–500 daily loan applications through a new B2C channel, and reduced error rates by half. 4 years across e-commerce and fintech.</w:t>
       </w:r>
     </w:p>
     <w:p>
@@ -603,7 +603,7 @@
           <w:sz w:val="16"/>
           <w:szCs w:val="16"/>
         </w:rPr>
-        <w:t xml:space="preserve">(In-App Loan Applications, Online Payment Processing)</w:t>
+        <w:t xml:space="preserve">(300–500 Daily Applications, Online Payment Processing)</w:t>
       </w:r>
     </w:p>
     <w:p>
@@ -638,7 +638,7 @@
           <w:sz w:val="16"/>
           <w:szCs w:val="16"/>
         </w:rPr>
-        <w:t xml:space="preserve">(Real-Time Monitoring, 10+ Active Users, Digital E-Signature)</w:t>
+        <w:t xml:space="preserve">(Real-Time Monitoring, 2x Fewer Errors, Digital E-Signature)</w:t>
       </w:r>
     </w:p>
     <w:p>

</xml_diff>

<commit_message>
Sync latest CV to root directory
</commit_message>
<xml_diff>
--- a/Zamir_Camalov_BA_CV_EN.docx
+++ b/Zamir_Camalov_BA_CV_EN.docx
@@ -664,7 +664,7 @@
           <w:sz w:val="17"/>
           <w:szCs w:val="17"/>
         </w:rPr>
-        <w:t xml:space="preserve">  Partner Onboarding &amp; Loan Application Management  </w:t>
+        <w:t xml:space="preserve">  End-to-End Credit Lifecycle  </w:t>
       </w:r>
       <w:r>
         <w:rPr>
@@ -673,7 +673,7 @@
           <w:sz w:val="16"/>
           <w:szCs w:val="16"/>
         </w:rPr>
-        <w:t xml:space="preserve">(Automated Onboarding, Manual Calls Eliminated)</w:t>
+        <w:t xml:space="preserve">(Application, Disbursement, Collection, Cross-Functional)</w:t>
       </w:r>
     </w:p>
     <w:p>

</xml_diff>

<commit_message>
Remove GitHub link from CV contact line
</commit_message>
<xml_diff>
--- a/Zamir_Camalov_BA_CV_EN.docx
+++ b/Zamir_Camalov_BA_CV_EN.docx
@@ -113,25 +113,6 @@
               </w:rPr>
               <w:t xml:space="preserve">Baku, Azerbaijan</w:t>
             </w:r>
-            <w:r>
-              <w:rPr>
-                <w:rFonts w:ascii="Calibri" w:eastAsia="Microsoft YaHei"/>
-                <w:color w:val="CCCCCC"/>
-                <w:sz w:val="16"/>
-                <w:szCs w:val="16"/>
-              </w:rPr>
-              <w:t xml:space="preserve">   |   </w:t>
-            </w:r>
-            <w:r>
-              <w:rPr>
-                <w:rFonts w:ascii="Calibri" w:eastAsia="Microsoft YaHei"/>
-                <w:color w:val="2A6496"/>
-                <w:sz w:val="16"/>
-                <w:szCs w:val="16"/>
-                <w:u w:val="single" w:color="2A6496"/>
-              </w:rPr>
-              <w:t xml:space="preserve">github.com/ZamirJamalov/ba-practice</w:t>
-            </w:r>
           </w:p>
         </w:tc>
       </w:tr>

</xml_diff>

<commit_message>
Remove redundant phrases in methodology bullets
</commit_message>
<xml_diff>
--- a/Zamir_Camalov_BA_CV_EN.docx
+++ b/Zamir_Camalov_BA_CV_EN.docx
@@ -721,7 +721,7 @@
           <w:sz w:val="17"/>
           <w:szCs w:val="17"/>
         </w:rPr>
-        <w:t xml:space="preserve">  Requirements Documentation: Authored detailed FRDs with numbered requirements (REQ-101 format), wrote User Stories with Gherkin Acceptance Criteria, and maintained traceability across sprints</w:t>
+        <w:t xml:space="preserve">  Requirements Documentation: Authored detailed FRDs with REQ-101 numbered requirements, wrote User Stories with Gherkin Acceptance Criteria, and maintained traceability across sprints</w:t>
       </w:r>
     </w:p>
     <w:p>
@@ -745,7 +745,7 @@
           <w:sz w:val="17"/>
           <w:szCs w:val="17"/>
         </w:rPr>
-        <w:t xml:space="preserve">  Technical Specification: Defined REST API specifications using Swagger/OpenAPI 3.0 and created data mapping documents for seamless handoff to development teams</w:t>
+        <w:t xml:space="preserve">  Technical Specification: Defined REST API specifications in Swagger/OpenAPI 3.0 and created data mapping documents for seamless developer handoff</w:t>
       </w:r>
     </w:p>
     <w:p>

</xml_diff>

<commit_message>
Add Backlog Prioritization as 6th methodology bullet
</commit_message>
<xml_diff>
--- a/Zamir_Camalov_BA_CV_EN.docx
+++ b/Zamir_Camalov_BA_CV_EN.docx
@@ -793,6 +793,30 @@
           <w:sz w:val="17"/>
           <w:szCs w:val="17"/>
         </w:rPr>
+        <w:t xml:space="preserve">  Backlog Prioritization: Ranked requirements and user stories using structured frameworks (RICE, WSJF) to align sprint planning with business value and stakeholder priorities</w:t>
+      </w:r>
+    </w:p>
+    <w:p>
+      <w:pPr>
+        <w:spacing w:after="16" w:before="16" w:line="260"/>
+        <w:ind w:left="160" w:hanging="160"/>
+      </w:pPr>
+      <w:r>
+        <w:rPr>
+          <w:rFonts w:ascii="Calibri" w:eastAsia="Microsoft YaHei"/>
+          <w:color w:val="2A6496"/>
+          <w:sz w:val="17"/>
+          <w:szCs w:val="17"/>
+        </w:rPr>
+        <w:t xml:space="preserve">•</w:t>
+      </w:r>
+      <w:r>
+        <w:rPr>
+          <w:rFonts w:ascii="Calibri" w:eastAsia="Microsoft YaHei"/>
+          <w:color w:val="333333"/>
+          <w:sz w:val="17"/>
+          <w:szCs w:val="17"/>
+        </w:rPr>
         <w:t xml:space="preserve">  Data-Driven Decision Making: Leveraged SQL data analysis to resolve conflicting stakeholder priorities, presenting evidence-based recommendations to drive consensus</w:t>
       </w:r>
     </w:p>

</xml_diff>

<commit_message>
Switch to RICE framework (remove WSJF)
</commit_message>
<xml_diff>
--- a/Zamir_Camalov_BA_CV_EN.docx
+++ b/Zamir_Camalov_BA_CV_EN.docx
@@ -282,7 +282,7 @@
           <w:sz w:val="18"/>
           <w:szCs w:val="18"/>
         </w:rPr>
-        <w:t xml:space="preserve">BRD / FRD / SRS  |  User Stories &amp; Acceptance Criteria (Gherkin)  |  BPMN (As-Is / To-Be)  |  Gap Analysis  |  Stakeholder Interviews  |  Backlog Prioritization (WSJF / RICE)</w:t>
+        <w:t xml:space="preserve">BRD / FRD / SRS  |  User Stories &amp; Acceptance Criteria (Gherkin)  |  BPMN (As-Is / To-Be)  |  Gap Analysis  |  Stakeholder Interviews  |  Backlog Prioritization (RICE)</w:t>
       </w:r>
     </w:p>
     <w:p>
@@ -793,7 +793,7 @@
           <w:sz w:val="17"/>
           <w:szCs w:val="17"/>
         </w:rPr>
-        <w:t xml:space="preserve">  Backlog Prioritization: Ranked requirements and user stories using structured frameworks (RICE, WSJF) to align sprint planning with business value and stakeholder priorities</w:t>
+        <w:t xml:space="preserve">  Backlog Prioritization: Ranked requirements and user stories using RICE framework to align sprint planning with business value and stakeholder priorities</w:t>
       </w:r>
     </w:p>
     <w:p>

</xml_diff>

<commit_message>
Final check: add BRD/SRS to methodology, add credit lifecycle to summary
</commit_message>
<xml_diff>
--- a/Zamir_Camalov_BA_CV_EN.docx
+++ b/Zamir_Camalov_BA_CV_EN.docx
@@ -189,7 +189,7 @@
           <w:sz w:val="18"/>
           <w:szCs w:val="18"/>
         </w:rPr>
-        <w:t xml:space="preserve">Business Analyst with 4 years across e-commerce and fintech, specializing in process digitization, requirements documentation, and end-to-end delivery coordination. Uniquely combines BA methodology with a software engineering background — enabling precise translation of business needs into technical specifications and seamless collaboration with development teams. Delivered production systems spanning credit scoring, B2C sales channels, and operational dashboards.</w:t>
+        <w:t xml:space="preserve">Business Analyst with 4 years across e-commerce and fintech, specializing in process digitization, requirements documentation, and end-to-end delivery coordination. Uniquely combines BA methodology with a software engineering background — enabling precise translation of business needs into technical specifications and seamless collaboration with development teams. Delivered production systems spanning credit scoring, B2C sales channels, operational dashboards, and end-to-end credit lifecycle management.</w:t>
       </w:r>
     </w:p>
     <w:p>
@@ -721,7 +721,7 @@
           <w:sz w:val="17"/>
           <w:szCs w:val="17"/>
         </w:rPr>
-        <w:t xml:space="preserve">  Requirements Documentation: Authored detailed FRDs with REQ-101 numbered requirements, wrote User Stories with Gherkin Acceptance Criteria, and maintained traceability across sprints</w:t>
+        <w:t xml:space="preserve">  Requirements Documentation: Authored detailed BRDs, FRDs, and SRS documents with REQ-101 numbered requirements, wrote User Stories with Gherkin Acceptance Criteria, and maintained traceability across sprints</w:t>
       </w:r>
     </w:p>
     <w:p>

</xml_diff>

<commit_message>
Add UML to Skills, Sequence Diagrams to Skills + Methodology
</commit_message>
<xml_diff>
--- a/Zamir_Camalov_BA_CV_EN.docx
+++ b/Zamir_Camalov_BA_CV_EN.docx
@@ -282,7 +282,7 @@
           <w:sz w:val="18"/>
           <w:szCs w:val="18"/>
         </w:rPr>
-        <w:t xml:space="preserve">BRD / FRD / SRS  |  User Stories &amp; Acceptance Criteria (Gherkin)  |  BPMN (As-Is / To-Be)  |  Gap Analysis  |  Stakeholder Interviews  |  Backlog Prioritization (RICE)</w:t>
+        <w:t xml:space="preserve">BRD / FRD / SRS  |  User Stories &amp; Acceptance Criteria (Gherkin)  |  BPMN (As-Is / To-Be) | UML | Sequence Diagrams  |  Gap Analysis  |  Stakeholder Interviews  |  Backlog Prioritization (RICE)</w:t>
       </w:r>
     </w:p>
     <w:p>
@@ -697,7 +697,7 @@
           <w:sz w:val="17"/>
           <w:szCs w:val="17"/>
         </w:rPr>
-        <w:t xml:space="preserve">  Discovery &amp; Process Modeling: Conducted structured stakeholder sessions with risk, sales, and operations teams to map As-Is workflows, identify pain points, and design To-Be BPMN process models</w:t>
+        <w:t xml:space="preserve">  Discovery &amp; Process Modeling: Conducted structured stakeholder sessions with risk, sales, and operations teams to map As-Is workflows, identify pain points, and design To-Be BPMN process models and sequence diagrams for system interaction flows</w:t>
       </w:r>
     </w:p>
     <w:p>
@@ -745,7 +745,7 @@
           <w:sz w:val="17"/>
           <w:szCs w:val="17"/>
         </w:rPr>
-        <w:t xml:space="preserve">  Technical Specification: Defined REST API specifications in Swagger/OpenAPI 3.0 and created data mapping documents for seamless developer handoff</w:t>
+        <w:t xml:space="preserve">  Technical Specification: Defined REST API specifications in Swagger/OpenAPI 3.0, created sequence diagrams for integration flows, and prepared data mapping documents for seamless developer handoff</w:t>
       </w:r>
     </w:p>
     <w:p>

</xml_diff>

<commit_message>
Rewrite Birbank: role progression Dev->L2->BA, bonus system, update summary to 2+ years
</commit_message>
<xml_diff>
--- a/Zamir_Camalov_BA_CV_EN.docx
+++ b/Zamir_Camalov_BA_CV_EN.docx
@@ -189,7 +189,7 @@
           <w:sz w:val="18"/>
           <w:szCs w:val="18"/>
         </w:rPr>
-        <w:t xml:space="preserve">Business Analyst with 4 years across e-commerce and fintech, specializing in process digitization, requirements documentation, and end-to-end delivery coordination. Uniquely combines BA methodology with a software engineering background — enabling precise translation of business needs into technical specifications and seamless collaboration with development teams. Delivered production systems spanning credit scoring, B2C sales channels, operational dashboards, and end-to-end credit lifecycle management.</w:t>
+        <w:t xml:space="preserve">Business Analyst with 2+ years across banking and fintech, specializing in process digitization, requirements documentation, and end-to-end delivery coordination. Uniquely combines BA methodology with a software engineering background — enabling precise translation of business needs into technical specifications and seamless collaboration with development teams. Delivered production systems spanning credit scoring, B2C sales channels, operational dashboards, and end-to-end credit lifecycle management.</w:t>
       </w:r>
     </w:p>
     <w:p>
@@ -836,7 +836,7 @@
           <w:sz w:val="20"/>
           <w:szCs w:val="20"/>
         </w:rPr>
-        <w:t xml:space="preserve">BirMarket (Umico)</w:t>
+        <w:t xml:space="preserve">Birbank</w:t>
       </w:r>
       <w:r>
         <w:rPr>
@@ -856,7 +856,7 @@
           <w:sz w:val="18"/>
           <w:szCs w:val="18"/>
         </w:rPr>
-        <w:t xml:space="preserve">Business Analyst</w:t>
+        <w:t xml:space="preserve">IT Business Analyst</w:t>
       </w:r>
       <w:r>
         <w:rPr>
@@ -876,6 +876,25 @@
     </w:p>
     <w:p>
       <w:pPr>
+        <w:spacing w:after="10" w:before="20" w:line="260"/>
+        <w:ind w:left="160"/>
+      </w:pPr>
+      <w:r>
+        <w:rPr>
+          <w:rFonts w:ascii="Calibri" w:eastAsia="Microsoft YaHei"/>
+          <w:b/>
+          <w:bCs/>
+          <w:i/>
+          <w:iCs/>
+          <w:color w:val="2A6496"/>
+          <w:sz w:val="17"/>
+          <w:szCs w:val="17"/>
+        </w:rPr>
+        <w:t xml:space="preserve">IT Business Analyst (2024–2025)</w:t>
+      </w:r>
+    </w:p>
+    <w:p>
+      <w:pPr>
         <w:spacing w:after="16" w:before="16" w:line="260"/>
         <w:ind w:left="160" w:hanging="160"/>
       </w:pPr>
@@ -895,7 +914,26 @@
           <w:sz w:val="17"/>
           <w:szCs w:val="17"/>
         </w:rPr>
-        <w:t xml:space="preserve">  Designed and documented the end-to-end seller onboarding process from scratch, conducting stakeholder interviews with operations, logistics, and warehouse teams to capture all edge cases and define measurable Acceptance Criteria</w:t>
+        <w:t xml:space="preserve">  Designed a customer loyalty bonus system enabling shoppers to earn rewards on purchases and redeem across participating partner merchants, conducting stakeholder sessions to define earning rules, eligibility criteria, and partner settlement workflows</w:t>
+      </w:r>
+    </w:p>
+    <w:p>
+      <w:pPr>
+        <w:spacing w:after="10" w:before="20" w:line="260"/>
+        <w:ind w:left="160"/>
+      </w:pPr>
+      <w:r>
+        <w:rPr>
+          <w:rFonts w:ascii="Calibri" w:eastAsia="Microsoft YaHei"/>
+          <w:b/>
+          <w:bCs/>
+          <w:i/>
+          <w:iCs/>
+          <w:color w:val="2A6496"/>
+          <w:sz w:val="17"/>
+          <w:szCs w:val="17"/>
+        </w:rPr>
+        <w:t xml:space="preserve">PostgreSQL Developer &amp; L2 Production Support (2022–2024)</w:t>
       </w:r>
     </w:p>
     <w:p>
@@ -919,31 +957,7 @@
           <w:sz w:val="17"/>
           <w:szCs w:val="17"/>
         </w:rPr>
-        <w:t xml:space="preserve">  Analyzed seller performance and inventory data using SQL queries (complex JOINs, GROUP BY aggregations), identified fulfillment bottlenecks, and presented prioritized improvement recommendations to the product team with supporting data</w:t>
-      </w:r>
-    </w:p>
-    <w:p>
-      <w:pPr>
-        <w:spacing w:after="16" w:before="16" w:line="260"/>
-        <w:ind w:left="160" w:hanging="160"/>
-      </w:pPr>
-      <w:r>
-        <w:rPr>
-          <w:rFonts w:ascii="Calibri" w:eastAsia="Microsoft YaHei"/>
-          <w:color w:val="2A6496"/>
-          <w:sz w:val="17"/>
-          <w:szCs w:val="17"/>
-        </w:rPr>
-        <w:t xml:space="preserve">•</w:t>
-      </w:r>
-      <w:r>
-        <w:rPr>
-          <w:rFonts w:ascii="Calibri" w:eastAsia="Microsoft YaHei"/>
-          <w:color w:val="333333"/>
-          <w:sz w:val="17"/>
-          <w:szCs w:val="17"/>
-        </w:rPr>
-        <w:t xml:space="preserve">  Collaborated with marketing and product teams on CMS-driven content changes and promotional campaigns, ensuring business copy requirements were accurately documented and delivered within sprint cycles without scope creep</w:t>
+        <w:t xml:space="preserve">  Built backend features using PostgreSQL, resolved L2 production incidents using ELK Stack log analysis and source code investigation, and coordinated back-to-back technical integration testing for new partner system onboarding</w:t>
       </w:r>
     </w:p>
     <w:p>

</xml_diff>

<commit_message>
Split into Birbonus (BA) + Umico (Dev/L2), fix summary to fintech & e-commerce
</commit_message>
<xml_diff>
--- a/Zamir_Camalov_BA_CV_EN.docx
+++ b/Zamir_Camalov_BA_CV_EN.docx
@@ -189,7 +189,7 @@
           <w:sz w:val="18"/>
           <w:szCs w:val="18"/>
         </w:rPr>
-        <w:t xml:space="preserve">Business Analyst with 2+ years across banking and fintech, specializing in process digitization, requirements documentation, and end-to-end delivery coordination. Uniquely combines BA methodology with a software engineering background — enabling precise translation of business needs into technical specifications and seamless collaboration with development teams. Delivered production systems spanning credit scoring, B2C sales channels, operational dashboards, and end-to-end credit lifecycle management.</w:t>
+        <w:t xml:space="preserve">Business Analyst with 2+ years across fintech and e-commerce, specializing in process digitization, requirements documentation, and end-to-end delivery coordination. Uniquely combines BA methodology with a software engineering background — enabling precise translation of business needs into technical specifications and seamless collaboration with development teams. Delivered production systems spanning credit scoring, B2C sales channels, operational dashboards, and end-to-end credit lifecycle management.</w:t>
       </w:r>
     </w:p>
     <w:p>
@@ -836,7 +836,7 @@
           <w:sz w:val="20"/>
           <w:szCs w:val="20"/>
         </w:rPr>
-        <w:t xml:space="preserve">Birbank</w:t>
+        <w:t xml:space="preserve">Birbonus</w:t>
       </w:r>
       <w:r>
         <w:rPr>
@@ -871,69 +871,85 @@
           <w:sz w:val="16"/>
           <w:szCs w:val="16"/>
         </w:rPr>
-        <w:t xml:space="preserve">2022 – 2025</w:t>
-      </w:r>
-    </w:p>
-    <w:p>
-      <w:pPr>
-        <w:spacing w:after="10" w:before="20" w:line="260"/>
-        <w:ind w:left="160"/>
+        <w:t xml:space="preserve">2024 – 2025</w:t>
+      </w:r>
+    </w:p>
+    <w:p>
+      <w:pPr>
+        <w:spacing w:after="16" w:before="16" w:line="260"/>
+        <w:ind w:left="160" w:hanging="160"/>
+      </w:pPr>
+      <w:r>
+        <w:rPr>
+          <w:rFonts w:ascii="Calibri" w:eastAsia="Microsoft YaHei"/>
+          <w:color w:val="2A6496"/>
+          <w:sz w:val="17"/>
+          <w:szCs w:val="17"/>
+        </w:rPr>
+        <w:t xml:space="preserve">•</w:t>
+      </w:r>
+      <w:r>
+        <w:rPr>
+          <w:rFonts w:ascii="Calibri" w:eastAsia="Microsoft YaHei"/>
+          <w:color w:val="333333"/>
+          <w:sz w:val="17"/>
+          <w:szCs w:val="17"/>
+        </w:rPr>
+        <w:t xml:space="preserve">  Designed a customer loyalty bonus system enabling shoppers to earn rewards on purchases and redeem across participating partner merchants, conducting stakeholder sessions to define earning rules, eligibility criteria, and partner settlement workflows</w:t>
+      </w:r>
+    </w:p>
+    <w:p>
+      <w:pPr>
+        <w:tabs>
+          <w:tab w:val="right" w:pos="9906"/>
+        </w:tabs>
+        <w:spacing w:after="16" w:before="120" w:line="260"/>
       </w:pPr>
       <w:r>
         <w:rPr>
           <w:rFonts w:ascii="Calibri" w:eastAsia="Microsoft YaHei"/>
           <w:b/>
           <w:bCs/>
+          <w:color w:val="1A1A1A"/>
+          <w:sz w:val="20"/>
+          <w:szCs w:val="20"/>
+        </w:rPr>
+        <w:t xml:space="preserve">Umico</w:t>
+      </w:r>
+      <w:r>
+        <w:rPr>
+          <w:rFonts w:ascii="Calibri" w:eastAsia="Microsoft YaHei"/>
+          <w:color w:val="777777"/>
+          <w:sz w:val="18"/>
+          <w:szCs w:val="18"/>
+        </w:rPr>
+        <w:t xml:space="preserve">  |  </w:t>
+      </w:r>
+      <w:r>
+        <w:rPr>
+          <w:rFonts w:ascii="Calibri" w:eastAsia="Microsoft YaHei"/>
           <w:i/>
           <w:iCs/>
-          <w:color w:val="2A6496"/>
-          <w:sz w:val="17"/>
-          <w:szCs w:val="17"/>
-        </w:rPr>
-        <w:t xml:space="preserve">IT Business Analyst (2024–2025)</w:t>
-      </w:r>
-    </w:p>
-    <w:p>
-      <w:pPr>
-        <w:spacing w:after="16" w:before="16" w:line="260"/>
-        <w:ind w:left="160" w:hanging="160"/>
-      </w:pPr>
-      <w:r>
-        <w:rPr>
-          <w:rFonts w:ascii="Calibri" w:eastAsia="Microsoft YaHei"/>
-          <w:color w:val="2A6496"/>
-          <w:sz w:val="17"/>
-          <w:szCs w:val="17"/>
-        </w:rPr>
-        <w:t xml:space="preserve">•</w:t>
-      </w:r>
-      <w:r>
-        <w:rPr>
-          <w:rFonts w:ascii="Calibri" w:eastAsia="Microsoft YaHei"/>
-          <w:color w:val="333333"/>
-          <w:sz w:val="17"/>
-          <w:szCs w:val="17"/>
-        </w:rPr>
-        <w:t xml:space="preserve">  Designed a customer loyalty bonus system enabling shoppers to earn rewards on purchases and redeem across participating partner merchants, conducting stakeholder sessions to define earning rules, eligibility criteria, and partner settlement workflows</w:t>
-      </w:r>
-    </w:p>
-    <w:p>
-      <w:pPr>
-        <w:spacing w:after="10" w:before="20" w:line="260"/>
-        <w:ind w:left="160"/>
-      </w:pPr>
-      <w:r>
-        <w:rPr>
-          <w:rFonts w:ascii="Calibri" w:eastAsia="Microsoft YaHei"/>
-          <w:b/>
-          <w:bCs/>
-          <w:i/>
-          <w:iCs/>
-          <w:color w:val="2A6496"/>
-          <w:sz w:val="17"/>
-          <w:szCs w:val="17"/>
-        </w:rPr>
-        <w:t xml:space="preserve">PostgreSQL Developer &amp; L2 Production Support (2022–2024)</w:t>
+          <w:color w:val="333333"/>
+          <w:sz w:val="18"/>
+          <w:szCs w:val="18"/>
+        </w:rPr>
+        <w:t xml:space="preserve">PostgreSQL Developer &amp; L2 Support</w:t>
+      </w:r>
+      <w:r>
+        <w:rPr>
+          <w:rFonts w:ascii="Calibri" w:eastAsia="Microsoft YaHei"/>
+        </w:rPr>
+        <w:t xml:space="preserve">	</w:t>
+      </w:r>
+      <w:r>
+        <w:rPr>
+          <w:rFonts w:ascii="Calibri" w:eastAsia="Microsoft YaHei"/>
+          <w:color w:val="777777"/>
+          <w:sz w:val="16"/>
+          <w:szCs w:val="16"/>
+        </w:rPr>
+        <w:t xml:space="preserve">2022 – 2024</w:t>
       </w:r>
     </w:p>
     <w:p>

</xml_diff>

<commit_message>
Improve readability: body 10pt, headings 11pt, contact 9pt, tighter spacing
</commit_message>
<xml_diff>
--- a/Zamir_Camalov_BA_CV_EN.docx
+++ b/Zamir_Camalov_BA_CV_EN.docx
@@ -4,7 +4,7 @@
   <w:body>
     <w:p>
       <w:pPr>
-        <w:spacing w:after="30" w:before="160" w:line="276"/>
+        <w:spacing w:after="20" w:before="120" w:line="276"/>
         <w:jc w:val="left"/>
       </w:pPr>
       <w:r>
@@ -22,7 +22,7 @@
     </w:p>
     <w:p>
       <w:pPr>
-        <w:spacing w:after="50" w:before="0" w:line="276"/>
+        <w:spacing w:after="30" w:before="0" w:line="276"/>
       </w:pPr>
       <w:r>
         <w:rPr>
@@ -72,8 +72,8 @@
               <w:rPr>
                 <w:rFonts w:ascii="Calibri" w:eastAsia="Microsoft YaHei"/>
                 <w:color w:val="777777"/>
-                <w:sz w:val="16"/>
-                <w:szCs w:val="16"/>
+                <w:sz w:val="18"/>
+                <w:szCs w:val="18"/>
               </w:rPr>
               <w:t xml:space="preserve">+994 55 207 7228</w:t>
             </w:r>
@@ -81,8 +81,8 @@
               <w:rPr>
                 <w:rFonts w:ascii="Calibri" w:eastAsia="Microsoft YaHei"/>
                 <w:color w:val="CCCCCC"/>
-                <w:sz w:val="16"/>
-                <w:szCs w:val="16"/>
+                <w:sz w:val="18"/>
+                <w:szCs w:val="18"/>
               </w:rPr>
               <w:t xml:space="preserve">   |   </w:t>
             </w:r>
@@ -90,8 +90,8 @@
               <w:rPr>
                 <w:rFonts w:ascii="Calibri" w:eastAsia="Microsoft YaHei"/>
                 <w:color w:val="777777"/>
-                <w:sz w:val="16"/>
-                <w:szCs w:val="16"/>
+                <w:sz w:val="18"/>
+                <w:szCs w:val="18"/>
               </w:rPr>
               <w:t xml:space="preserve">jamalov.zamir@gmail.com</w:t>
             </w:r>
@@ -99,8 +99,8 @@
               <w:rPr>
                 <w:rFonts w:ascii="Calibri" w:eastAsia="Microsoft YaHei"/>
                 <w:color w:val="CCCCCC"/>
-                <w:sz w:val="16"/>
-                <w:szCs w:val="16"/>
+                <w:sz w:val="18"/>
+                <w:szCs w:val="18"/>
               </w:rPr>
               <w:t xml:space="preserve">   |   </w:t>
             </w:r>
@@ -108,8 +108,8 @@
               <w:rPr>
                 <w:rFonts w:ascii="Calibri" w:eastAsia="Microsoft YaHei"/>
                 <w:color w:val="777777"/>
-                <w:sz w:val="16"/>
-                <w:szCs w:val="16"/>
+                <w:sz w:val="18"/>
+                <w:szCs w:val="18"/>
               </w:rPr>
               <w:t xml:space="preserve">Baku, Azerbaijan</w:t>
             </w:r>
@@ -119,7 +119,7 @@
     </w:tbl>
     <w:p>
       <w:pPr>
-        <w:spacing w:after="0" w:before="50"/>
+        <w:spacing w:after="0" w:before="40"/>
       </w:pPr>
     </w:p>
     <w:tbl>
@@ -139,7 +139,7 @@
       </w:tblGrid>
       <w:tr>
         <w:trPr>
-          <w:trHeight w:val="320" w:hRule="exact"/>
+          <w:trHeight w:val="280" w:hRule="exact"/>
         </w:trPr>
         <w:tc>
           <w:tcPr>
@@ -163,8 +163,8 @@
                 <w:bCs/>
                 <w:color w:val="2A6496"/>
                 <w:spacing w:val="80"/>
-                <w:sz w:val="19"/>
-                <w:szCs w:val="19"/>
+                <w:sz w:val="22"/>
+                <w:szCs w:val="22"/>
               </w:rPr>
               <w:t xml:space="preserve">PROFILE SUMMARY</w:t>
             </w:r>
@@ -174,27 +174,27 @@
     </w:tbl>
     <w:p>
       <w:pPr>
-        <w:spacing w:after="0" w:before="30"/>
-      </w:pPr>
-    </w:p>
-    <w:p>
-      <w:pPr>
-        <w:spacing w:after="16" w:before="16" w:line="260"/>
+        <w:spacing w:after="0" w:before="24"/>
+      </w:pPr>
+    </w:p>
+    <w:p>
+      <w:pPr>
+        <w:spacing w:after="12" w:before="12" w:line="240"/>
         <w:jc w:val="both"/>
       </w:pPr>
       <w:r>
         <w:rPr>
           <w:rFonts w:ascii="Calibri" w:eastAsia="Microsoft YaHei"/>
           <w:color w:val="333333"/>
-          <w:sz w:val="18"/>
-          <w:szCs w:val="18"/>
+          <w:sz w:val="20"/>
+          <w:szCs w:val="20"/>
         </w:rPr>
         <w:t xml:space="preserve">Business Analyst with 2+ years across fintech and e-commerce, specializing in process digitization, requirements documentation, and end-to-end delivery coordination. Engineering background enables precise translation of business needs into technical specifications. Having delivered production systems in financial services, now looking to bring the same analytical approach to retail process optimization.</w:t>
       </w:r>
     </w:p>
     <w:p>
       <w:pPr>
-        <w:spacing w:after="0" w:before="50"/>
+        <w:spacing w:after="0" w:before="40"/>
       </w:pPr>
     </w:p>
     <w:tbl>
@@ -214,7 +214,7 @@
       </w:tblGrid>
       <w:tr>
         <w:trPr>
-          <w:trHeight w:val="320" w:hRule="exact"/>
+          <w:trHeight w:val="280" w:hRule="exact"/>
         </w:trPr>
         <w:tc>
           <w:tcPr>
@@ -238,8 +238,8 @@
                 <w:bCs/>
                 <w:color w:val="2A6496"/>
                 <w:spacing w:val="80"/>
-                <w:sz w:val="19"/>
-                <w:szCs w:val="19"/>
+                <w:sz w:val="22"/>
+                <w:szCs w:val="22"/>
               </w:rPr>
               <w:t xml:space="preserve">CORE SKILLS</w:t>
             </w:r>
@@ -249,12 +249,12 @@
     </w:tbl>
     <w:p>
       <w:pPr>
-        <w:spacing w:after="0" w:before="30"/>
-      </w:pPr>
-    </w:p>
-    <w:p>
-      <w:pPr>
-        <w:spacing w:after="30" w:before="30" w:line="260"/>
+        <w:spacing w:after="0" w:before="24"/>
+      </w:pPr>
+    </w:p>
+    <w:p>
+      <w:pPr>
+        <w:spacing w:after="24" w:before="24" w:line="245"/>
       </w:pPr>
       <w:r>
         <w:rPr>
@@ -262,16 +262,16 @@
           <w:b/>
           <w:bCs/>
           <w:color w:val="1A1A1A"/>
-          <w:sz w:val="18"/>
-          <w:szCs w:val="18"/>
+          <w:sz w:val="20"/>
+          <w:szCs w:val="20"/>
         </w:rPr>
         <w:t xml:space="preserve">Business Analysis</w:t>
       </w:r>
       <w:r>
         <w:rPr>
           <w:rFonts w:ascii="Calibri" w:eastAsia="Microsoft YaHei"/>
-          <w:sz w:val="18"/>
-          <w:szCs w:val="18"/>
+          <w:sz w:val="20"/>
+          <w:szCs w:val="20"/>
         </w:rPr>
         <w:t xml:space="preserve">   </w:t>
       </w:r>
@@ -279,15 +279,15 @@
         <w:rPr>
           <w:rFonts w:ascii="Calibri" w:eastAsia="Microsoft YaHei"/>
           <w:color w:val="333333"/>
-          <w:sz w:val="18"/>
-          <w:szCs w:val="18"/>
+          <w:sz w:val="20"/>
+          <w:szCs w:val="20"/>
         </w:rPr>
         <w:t xml:space="preserve">BRD / FRD / SRS  |  User Stories &amp; Acceptance Criteria (Gherkin)  |  BPMN (As-Is / To-Be) | UML | Sequence Diagrams  |  Gap Analysis  |  Stakeholder Interviews  |  Backlog Prioritization (RICE)</w:t>
       </w:r>
     </w:p>
     <w:p>
       <w:pPr>
-        <w:spacing w:after="30" w:before="30" w:line="260"/>
+        <w:spacing w:after="24" w:before="24" w:line="245"/>
       </w:pPr>
       <w:r>
         <w:rPr>
@@ -295,16 +295,16 @@
           <w:b/>
           <w:bCs/>
           <w:color w:val="1A1A1A"/>
-          <w:sz w:val="18"/>
-          <w:szCs w:val="18"/>
+          <w:sz w:val="20"/>
+          <w:szCs w:val="20"/>
         </w:rPr>
         <w:t xml:space="preserve">Technical</w:t>
       </w:r>
       <w:r>
         <w:rPr>
           <w:rFonts w:ascii="Calibri" w:eastAsia="Microsoft YaHei"/>
-          <w:sz w:val="18"/>
-          <w:szCs w:val="18"/>
+          <w:sz w:val="20"/>
+          <w:szCs w:val="20"/>
         </w:rPr>
         <w:t xml:space="preserve">   </w:t>
       </w:r>
@@ -312,15 +312,15 @@
         <w:rPr>
           <w:rFonts w:ascii="Calibri" w:eastAsia="Microsoft YaHei"/>
           <w:color w:val="333333"/>
-          <w:sz w:val="18"/>
-          <w:szCs w:val="18"/>
+          <w:sz w:val="20"/>
+          <w:szCs w:val="20"/>
         </w:rPr>
         <w:t xml:space="preserve">REST API &amp; JSON  |  Swagger / OpenAPI 3.0  |  Postman (API Testing)  |  SQL (JOIN, GROUP BY, Subqueries)  |  SDLC</w:t>
       </w:r>
     </w:p>
     <w:p>
       <w:pPr>
-        <w:spacing w:after="30" w:before="30" w:line="260"/>
+        <w:spacing w:after="24" w:before="24" w:line="245"/>
       </w:pPr>
       <w:r>
         <w:rPr>
@@ -328,16 +328,16 @@
           <w:b/>
           <w:bCs/>
           <w:color w:val="1A1A1A"/>
-          <w:sz w:val="18"/>
-          <w:szCs w:val="18"/>
+          <w:sz w:val="20"/>
+          <w:szCs w:val="20"/>
         </w:rPr>
         <w:t xml:space="preserve">Process &amp; Tools</w:t>
       </w:r>
       <w:r>
         <w:rPr>
           <w:rFonts w:ascii="Calibri" w:eastAsia="Microsoft YaHei"/>
-          <w:sz w:val="18"/>
-          <w:szCs w:val="18"/>
+          <w:sz w:val="20"/>
+          <w:szCs w:val="20"/>
         </w:rPr>
         <w:t xml:space="preserve">   </w:t>
       </w:r>
@@ -345,15 +345,15 @@
         <w:rPr>
           <w:rFonts w:ascii="Calibri" w:eastAsia="Microsoft YaHei"/>
           <w:color w:val="333333"/>
-          <w:sz w:val="18"/>
-          <w:szCs w:val="18"/>
+          <w:sz w:val="20"/>
+          <w:szCs w:val="20"/>
         </w:rPr>
         <w:t xml:space="preserve">Agile / Scrum  |  Jira  |  Confluence  |  UAT Planning &amp; Coordination  |  L2 Production Support (ELK Stack)</w:t>
       </w:r>
     </w:p>
     <w:p>
       <w:pPr>
-        <w:spacing w:after="30" w:before="30" w:line="260"/>
+        <w:spacing w:after="24" w:before="24" w:line="245"/>
       </w:pPr>
       <w:r>
         <w:rPr>
@@ -361,16 +361,16 @@
           <w:b/>
           <w:bCs/>
           <w:color w:val="1A1A1A"/>
-          <w:sz w:val="18"/>
-          <w:szCs w:val="18"/>
+          <w:sz w:val="20"/>
+          <w:szCs w:val="20"/>
         </w:rPr>
         <w:t xml:space="preserve">Languages</w:t>
       </w:r>
       <w:r>
         <w:rPr>
           <w:rFonts w:ascii="Calibri" w:eastAsia="Microsoft YaHei"/>
-          <w:sz w:val="18"/>
-          <w:szCs w:val="18"/>
+          <w:sz w:val="20"/>
+          <w:szCs w:val="20"/>
         </w:rPr>
         <w:t xml:space="preserve">   </w:t>
       </w:r>
@@ -378,15 +378,15 @@
         <w:rPr>
           <w:rFonts w:ascii="Calibri" w:eastAsia="Microsoft YaHei"/>
           <w:color w:val="333333"/>
-          <w:sz w:val="18"/>
-          <w:szCs w:val="18"/>
+          <w:sz w:val="20"/>
+          <w:szCs w:val="20"/>
         </w:rPr>
         <w:t xml:space="preserve">Azerbaijani (Native)  |  Russian (Fluent)  |  English (Professional / Technical Documentation)</w:t>
       </w:r>
     </w:p>
     <w:p>
       <w:pPr>
-        <w:spacing w:after="0" w:before="50"/>
+        <w:spacing w:after="0" w:before="40"/>
       </w:pPr>
     </w:p>
     <w:tbl>
@@ -406,7 +406,7 @@
       </w:tblGrid>
       <w:tr>
         <w:trPr>
-          <w:trHeight w:val="320" w:hRule="exact"/>
+          <w:trHeight w:val="280" w:hRule="exact"/>
         </w:trPr>
         <w:tc>
           <w:tcPr>
@@ -430,8 +430,8 @@
                 <w:bCs/>
                 <w:color w:val="2A6496"/>
                 <w:spacing w:val="80"/>
-                <w:sz w:val="19"/>
-                <w:szCs w:val="19"/>
+                <w:sz w:val="22"/>
+                <w:szCs w:val="22"/>
               </w:rPr>
               <w:t xml:space="preserve">PROFESSIONAL EXPERIENCE</w:t>
             </w:r>
@@ -441,7 +441,7 @@
     </w:tbl>
     <w:p>
       <w:pPr>
-        <w:spacing w:after="0" w:before="30"/>
+        <w:spacing w:after="0" w:before="24"/>
       </w:pPr>
     </w:p>
     <w:p>
@@ -449,7 +449,7 @@
         <w:tabs>
           <w:tab w:val="right" w:pos="9906"/>
         </w:tabs>
-        <w:spacing w:after="16" w:before="120" w:line="260"/>
+        <w:spacing w:after="12" w:before="100" w:line="250"/>
       </w:pPr>
       <w:r>
         <w:rPr>
@@ -466,8 +466,8 @@
         <w:rPr>
           <w:rFonts w:ascii="Calibri" w:eastAsia="Microsoft YaHei"/>
           <w:color w:val="777777"/>
-          <w:sz w:val="18"/>
-          <w:szCs w:val="18"/>
+          <w:sz w:val="19"/>
+          <w:szCs w:val="19"/>
         </w:rPr>
         <w:t xml:space="preserve">  |  </w:t>
       </w:r>
@@ -477,8 +477,8 @@
           <w:i/>
           <w:iCs/>
           <w:color w:val="333333"/>
-          <w:sz w:val="18"/>
-          <w:szCs w:val="18"/>
+          <w:sz w:val="19"/>
+          <w:szCs w:val="19"/>
         </w:rPr>
         <w:t xml:space="preserve">IT Business Analyst</w:t>
       </w:r>
@@ -492,15 +492,15 @@
         <w:rPr>
           <w:rFonts w:ascii="Calibri" w:eastAsia="Microsoft YaHei"/>
           <w:color w:val="777777"/>
-          <w:sz w:val="16"/>
-          <w:szCs w:val="16"/>
+          <w:sz w:val="17"/>
+          <w:szCs w:val="17"/>
         </w:rPr>
         <w:t xml:space="preserve">2025 – Present</w:t>
       </w:r>
     </w:p>
     <w:p>
       <w:pPr>
-        <w:spacing w:after="20" w:before="100" w:line="260"/>
+        <w:spacing w:after="16" w:before="80" w:line="250"/>
       </w:pPr>
       <w:r>
         <w:rPr>
@@ -511,23 +511,23 @@
           <w:iCs/>
           <w:color w:val="1A1A1A"/>
           <w:spacing w:val="40"/>
-          <w:sz w:val="18"/>
-          <w:szCs w:val="18"/>
+          <w:sz w:val="19"/>
+          <w:szCs w:val="19"/>
         </w:rPr>
         <w:t xml:space="preserve">Projects Delivered</w:t>
       </w:r>
     </w:p>
     <w:p>
       <w:pPr>
-        <w:spacing w:after="10" w:before="10" w:line="250"/>
+        <w:spacing w:after="8" w:before="8" w:line="245"/>
         <w:ind w:left="200" w:hanging="200"/>
       </w:pPr>
       <w:r>
         <w:rPr>
           <w:rFonts w:ascii="Calibri" w:eastAsia="Microsoft YaHei"/>
           <w:color w:val="2A6496"/>
-          <w:sz w:val="17"/>
-          <w:szCs w:val="17"/>
+          <w:sz w:val="19"/>
+          <w:szCs w:val="19"/>
         </w:rPr>
         <w:t xml:space="preserve">•</w:t>
       </w:r>
@@ -537,8 +537,8 @@
           <w:b/>
           <w:bCs/>
           <w:color w:val="1A1A1A"/>
-          <w:sz w:val="17"/>
-          <w:szCs w:val="17"/>
+          <w:sz w:val="19"/>
+          <w:szCs w:val="19"/>
         </w:rPr>
         <w:t xml:space="preserve">  BNPL Credit Scoring &amp; Pre-Screen Risk Assessment  </w:t>
       </w:r>
@@ -546,23 +546,23 @@
         <w:rPr>
           <w:rFonts w:ascii="Calibri" w:eastAsia="Microsoft YaHei"/>
           <w:color w:val="777777"/>
-          <w:sz w:val="16"/>
-          <w:szCs w:val="16"/>
+          <w:sz w:val="18"/>
+          <w:szCs w:val="18"/>
         </w:rPr>
         <w:t xml:space="preserve">(2x Faster Credit Decisions, Automated Multi-Factor Assessment)</w:t>
       </w:r>
     </w:p>
     <w:p>
       <w:pPr>
-        <w:spacing w:after="10" w:before="10" w:line="250"/>
+        <w:spacing w:after="8" w:before="8" w:line="245"/>
         <w:ind w:left="200" w:hanging="200"/>
       </w:pPr>
       <w:r>
         <w:rPr>
           <w:rFonts w:ascii="Calibri" w:eastAsia="Microsoft YaHei"/>
           <w:color w:val="2A6496"/>
-          <w:sz w:val="17"/>
-          <w:szCs w:val="17"/>
+          <w:sz w:val="19"/>
+          <w:szCs w:val="19"/>
         </w:rPr>
         <w:t xml:space="preserve">•</w:t>
       </w:r>
@@ -572,8 +572,8 @@
           <w:b/>
           <w:bCs/>
           <w:color w:val="1A1A1A"/>
-          <w:sz w:val="17"/>
-          <w:szCs w:val="17"/>
+          <w:sz w:val="19"/>
+          <w:szCs w:val="19"/>
         </w:rPr>
         <w:t xml:space="preserve">  B2C Sales Channel &amp; Payment Gateway Integration  </w:t>
       </w:r>
@@ -581,23 +581,23 @@
         <w:rPr>
           <w:rFonts w:ascii="Calibri" w:eastAsia="Microsoft YaHei"/>
           <w:color w:val="777777"/>
-          <w:sz w:val="16"/>
-          <w:szCs w:val="16"/>
+          <w:sz w:val="18"/>
+          <w:szCs w:val="18"/>
         </w:rPr>
         <w:t xml:space="preserve">(300–500 Daily Applications, Online Payment Processing)</w:t>
       </w:r>
     </w:p>
     <w:p>
       <w:pPr>
-        <w:spacing w:after="10" w:before="10" w:line="250"/>
+        <w:spacing w:after="8" w:before="8" w:line="245"/>
         <w:ind w:left="200" w:hanging="200"/>
       </w:pPr>
       <w:r>
         <w:rPr>
           <w:rFonts w:ascii="Calibri" w:eastAsia="Microsoft YaHei"/>
           <w:color w:val="2A6496"/>
-          <w:sz w:val="17"/>
-          <w:szCs w:val="17"/>
+          <w:sz w:val="19"/>
+          <w:szCs w:val="19"/>
         </w:rPr>
         <w:t xml:space="preserve">•</w:t>
       </w:r>
@@ -607,8 +607,8 @@
           <w:b/>
           <w:bCs/>
           <w:color w:val="1A1A1A"/>
-          <w:sz w:val="17"/>
-          <w:szCs w:val="17"/>
+          <w:sz w:val="19"/>
+          <w:szCs w:val="19"/>
         </w:rPr>
         <w:t xml:space="preserve">  Goods Loan Delivery Tracking Dashboard  </w:t>
       </w:r>
@@ -616,23 +616,23 @@
         <w:rPr>
           <w:rFonts w:ascii="Calibri" w:eastAsia="Microsoft YaHei"/>
           <w:color w:val="777777"/>
-          <w:sz w:val="16"/>
-          <w:szCs w:val="16"/>
+          <w:sz w:val="18"/>
+          <w:szCs w:val="18"/>
         </w:rPr>
         <w:t xml:space="preserve">(Real-Time Monitoring, 2x Fewer Errors, Digital E-Signature)</w:t>
       </w:r>
     </w:p>
     <w:p>
       <w:pPr>
-        <w:spacing w:after="10" w:before="10" w:line="250"/>
+        <w:spacing w:after="8" w:before="8" w:line="245"/>
         <w:ind w:left="200" w:hanging="200"/>
       </w:pPr>
       <w:r>
         <w:rPr>
           <w:rFonts w:ascii="Calibri" w:eastAsia="Microsoft YaHei"/>
           <w:color w:val="2A6496"/>
-          <w:sz w:val="17"/>
-          <w:szCs w:val="17"/>
+          <w:sz w:val="19"/>
+          <w:szCs w:val="19"/>
         </w:rPr>
         <w:t xml:space="preserve">•</w:t>
       </w:r>
@@ -642,8 +642,8 @@
           <w:b/>
           <w:bCs/>
           <w:color w:val="1A1A1A"/>
-          <w:sz w:val="17"/>
-          <w:szCs w:val="17"/>
+          <w:sz w:val="19"/>
+          <w:szCs w:val="19"/>
         </w:rPr>
         <w:t xml:space="preserve">  End-to-End Credit Lifecycle  </w:t>
       </w:r>
@@ -651,15 +651,15 @@
         <w:rPr>
           <w:rFonts w:ascii="Calibri" w:eastAsia="Microsoft YaHei"/>
           <w:color w:val="777777"/>
-          <w:sz w:val="16"/>
-          <w:szCs w:val="16"/>
+          <w:sz w:val="18"/>
+          <w:szCs w:val="18"/>
         </w:rPr>
         <w:t xml:space="preserve">(Application, Disbursement, Collection, Cross-Functional)</w:t>
       </w:r>
     </w:p>
     <w:p>
       <w:pPr>
-        <w:spacing w:after="20" w:before="100" w:line="260"/>
+        <w:spacing w:after="16" w:before="80" w:line="250"/>
       </w:pPr>
       <w:r>
         <w:rPr>
@@ -670,23 +670,23 @@
           <w:iCs/>
           <w:color w:val="1A1A1A"/>
           <w:spacing w:val="40"/>
-          <w:sz w:val="18"/>
-          <w:szCs w:val="18"/>
+          <w:sz w:val="19"/>
+          <w:szCs w:val="19"/>
         </w:rPr>
         <w:t xml:space="preserve">Delivery Methodology</w:t>
       </w:r>
     </w:p>
     <w:p>
       <w:pPr>
-        <w:spacing w:after="16" w:before="16" w:line="260"/>
+        <w:spacing w:after="12" w:before="12" w:line="245"/>
         <w:ind w:left="160" w:hanging="160"/>
       </w:pPr>
       <w:r>
         <w:rPr>
           <w:rFonts w:ascii="Calibri" w:eastAsia="Microsoft YaHei"/>
           <w:color w:val="2A6496"/>
-          <w:sz w:val="17"/>
-          <w:szCs w:val="17"/>
+          <w:sz w:val="19"/>
+          <w:szCs w:val="19"/>
         </w:rPr>
         <w:t xml:space="preserve">•</w:t>
       </w:r>
@@ -694,23 +694,23 @@
         <w:rPr>
           <w:rFonts w:ascii="Calibri" w:eastAsia="Microsoft YaHei"/>
           <w:color w:val="333333"/>
-          <w:sz w:val="17"/>
-          <w:szCs w:val="17"/>
+          <w:sz w:val="19"/>
+          <w:szCs w:val="19"/>
         </w:rPr>
         <w:t xml:space="preserve">  Discovery &amp; Process Modeling: Conducted structured stakeholder sessions with risk, sales, and operations teams to map As-Is workflows, identify pain points, and design To-Be BPMN process models and sequence diagrams for system interaction flows</w:t>
       </w:r>
     </w:p>
     <w:p>
       <w:pPr>
-        <w:spacing w:after="16" w:before="16" w:line="260"/>
+        <w:spacing w:after="12" w:before="12" w:line="245"/>
         <w:ind w:left="160" w:hanging="160"/>
       </w:pPr>
       <w:r>
         <w:rPr>
           <w:rFonts w:ascii="Calibri" w:eastAsia="Microsoft YaHei"/>
           <w:color w:val="2A6496"/>
-          <w:sz w:val="17"/>
-          <w:szCs w:val="17"/>
+          <w:sz w:val="19"/>
+          <w:szCs w:val="19"/>
         </w:rPr>
         <w:t xml:space="preserve">•</w:t>
       </w:r>
@@ -718,23 +718,23 @@
         <w:rPr>
           <w:rFonts w:ascii="Calibri" w:eastAsia="Microsoft YaHei"/>
           <w:color w:val="333333"/>
-          <w:sz w:val="17"/>
-          <w:szCs w:val="17"/>
+          <w:sz w:val="19"/>
+          <w:szCs w:val="19"/>
         </w:rPr>
         <w:t xml:space="preserve">  Requirements Documentation: Authored detailed BRDs, FRDs, and SRS documents with REQ-101 numbered requirements, wrote User Stories with Gherkin Acceptance Criteria, and maintained traceability across sprints</w:t>
       </w:r>
     </w:p>
     <w:p>
       <w:pPr>
-        <w:spacing w:after="16" w:before="16" w:line="260"/>
+        <w:spacing w:after="12" w:before="12" w:line="245"/>
         <w:ind w:left="160" w:hanging="160"/>
       </w:pPr>
       <w:r>
         <w:rPr>
           <w:rFonts w:ascii="Calibri" w:eastAsia="Microsoft YaHei"/>
           <w:color w:val="2A6496"/>
-          <w:sz w:val="17"/>
-          <w:szCs w:val="17"/>
+          <w:sz w:val="19"/>
+          <w:szCs w:val="19"/>
         </w:rPr>
         <w:t xml:space="preserve">•</w:t>
       </w:r>
@@ -742,23 +742,23 @@
         <w:rPr>
           <w:rFonts w:ascii="Calibri" w:eastAsia="Microsoft YaHei"/>
           <w:color w:val="333333"/>
-          <w:sz w:val="17"/>
-          <w:szCs w:val="17"/>
+          <w:sz w:val="19"/>
+          <w:szCs w:val="19"/>
         </w:rPr>
         <w:t xml:space="preserve">  Technical Specification: Defined REST API specifications in Swagger/OpenAPI 3.0, created sequence diagrams for integration flows, and prepared data mapping documents for seamless developer handoff</w:t>
       </w:r>
     </w:p>
     <w:p>
       <w:pPr>
-        <w:spacing w:after="16" w:before="16" w:line="260"/>
+        <w:spacing w:after="12" w:before="12" w:line="245"/>
         <w:ind w:left="160" w:hanging="160"/>
       </w:pPr>
       <w:r>
         <w:rPr>
           <w:rFonts w:ascii="Calibri" w:eastAsia="Microsoft YaHei"/>
           <w:color w:val="2A6496"/>
-          <w:sz w:val="17"/>
-          <w:szCs w:val="17"/>
+          <w:sz w:val="19"/>
+          <w:szCs w:val="19"/>
         </w:rPr>
         <w:t xml:space="preserve">•</w:t>
       </w:r>
@@ -766,23 +766,23 @@
         <w:rPr>
           <w:rFonts w:ascii="Calibri" w:eastAsia="Microsoft YaHei"/>
           <w:color w:val="333333"/>
-          <w:sz w:val="17"/>
-          <w:szCs w:val="17"/>
+          <w:sz w:val="19"/>
+          <w:szCs w:val="19"/>
         </w:rPr>
         <w:t xml:space="preserve">  UAT &amp; Delivery Coordination: Coordinated UAT execution with business stakeholders, led bug triage meetings with QA and developers, and achieved on-time sign-off across multiple release cycles</w:t>
       </w:r>
     </w:p>
     <w:p>
       <w:pPr>
-        <w:spacing w:after="16" w:before="16" w:line="260"/>
+        <w:spacing w:after="12" w:before="12" w:line="245"/>
         <w:ind w:left="160" w:hanging="160"/>
       </w:pPr>
       <w:r>
         <w:rPr>
           <w:rFonts w:ascii="Calibri" w:eastAsia="Microsoft YaHei"/>
           <w:color w:val="2A6496"/>
-          <w:sz w:val="17"/>
-          <w:szCs w:val="17"/>
+          <w:sz w:val="19"/>
+          <w:szCs w:val="19"/>
         </w:rPr>
         <w:t xml:space="preserve">•</w:t>
       </w:r>
@@ -790,23 +790,23 @@
         <w:rPr>
           <w:rFonts w:ascii="Calibri" w:eastAsia="Microsoft YaHei"/>
           <w:color w:val="333333"/>
-          <w:sz w:val="17"/>
-          <w:szCs w:val="17"/>
+          <w:sz w:val="19"/>
+          <w:szCs w:val="19"/>
         </w:rPr>
         <w:t xml:space="preserve">  Backlog Prioritization: Ranked requirements and user stories using RICE framework to align sprint planning with business value and stakeholder priorities</w:t>
       </w:r>
     </w:p>
     <w:p>
       <w:pPr>
-        <w:spacing w:after="16" w:before="16" w:line="260"/>
+        <w:spacing w:after="12" w:before="12" w:line="245"/>
         <w:ind w:left="160" w:hanging="160"/>
       </w:pPr>
       <w:r>
         <w:rPr>
           <w:rFonts w:ascii="Calibri" w:eastAsia="Microsoft YaHei"/>
           <w:color w:val="2A6496"/>
-          <w:sz w:val="17"/>
-          <w:szCs w:val="17"/>
+          <w:sz w:val="19"/>
+          <w:szCs w:val="19"/>
         </w:rPr>
         <w:t xml:space="preserve">•</w:t>
       </w:r>
@@ -814,8 +814,8 @@
         <w:rPr>
           <w:rFonts w:ascii="Calibri" w:eastAsia="Microsoft YaHei"/>
           <w:color w:val="333333"/>
-          <w:sz w:val="17"/>
-          <w:szCs w:val="17"/>
+          <w:sz w:val="19"/>
+          <w:szCs w:val="19"/>
         </w:rPr>
         <w:t xml:space="preserve">  Data-Driven Decision Making: Leveraged SQL data analysis to resolve conflicting stakeholder priorities, presenting evidence-based recommendations to drive consensus</w:t>
       </w:r>
@@ -825,7 +825,7 @@
         <w:tabs>
           <w:tab w:val="right" w:pos="9906"/>
         </w:tabs>
-        <w:spacing w:after="16" w:before="120" w:line="260"/>
+        <w:spacing w:after="12" w:before="100" w:line="250"/>
       </w:pPr>
       <w:r>
         <w:rPr>
@@ -842,8 +842,8 @@
         <w:rPr>
           <w:rFonts w:ascii="Calibri" w:eastAsia="Microsoft YaHei"/>
           <w:color w:val="777777"/>
-          <w:sz w:val="18"/>
-          <w:szCs w:val="18"/>
+          <w:sz w:val="19"/>
+          <w:szCs w:val="19"/>
         </w:rPr>
         <w:t xml:space="preserve">  |  </w:t>
       </w:r>
@@ -853,8 +853,8 @@
           <w:i/>
           <w:iCs/>
           <w:color w:val="333333"/>
-          <w:sz w:val="18"/>
-          <w:szCs w:val="18"/>
+          <w:sz w:val="19"/>
+          <w:szCs w:val="19"/>
         </w:rPr>
         <w:t xml:space="preserve">IT Business Analyst</w:t>
       </w:r>
@@ -868,32 +868,32 @@
         <w:rPr>
           <w:rFonts w:ascii="Calibri" w:eastAsia="Microsoft YaHei"/>
           <w:color w:val="777777"/>
-          <w:sz w:val="16"/>
-          <w:szCs w:val="16"/>
-        </w:rPr>
-        <w:t xml:space="preserve">2024 – 2025</w:t>
-      </w:r>
-    </w:p>
-    <w:p>
-      <w:pPr>
-        <w:spacing w:after="16" w:before="16" w:line="260"/>
-        <w:ind w:left="160" w:hanging="160"/>
-      </w:pPr>
-      <w:r>
-        <w:rPr>
-          <w:rFonts w:ascii="Calibri" w:eastAsia="Microsoft YaHei"/>
-          <w:color w:val="2A6496"/>
           <w:sz w:val="17"/>
           <w:szCs w:val="17"/>
         </w:rPr>
+        <w:t xml:space="preserve">2024 – 2025</w:t>
+      </w:r>
+    </w:p>
+    <w:p>
+      <w:pPr>
+        <w:spacing w:after="12" w:before="12" w:line="245"/>
+        <w:ind w:left="160" w:hanging="160"/>
+      </w:pPr>
+      <w:r>
+        <w:rPr>
+          <w:rFonts w:ascii="Calibri" w:eastAsia="Microsoft YaHei"/>
+          <w:color w:val="2A6496"/>
+          <w:sz w:val="19"/>
+          <w:szCs w:val="19"/>
+        </w:rPr>
         <w:t xml:space="preserve">•</w:t>
       </w:r>
       <w:r>
         <w:rPr>
           <w:rFonts w:ascii="Calibri" w:eastAsia="Microsoft YaHei"/>
           <w:color w:val="333333"/>
-          <w:sz w:val="17"/>
-          <w:szCs w:val="17"/>
+          <w:sz w:val="19"/>
+          <w:szCs w:val="19"/>
         </w:rPr>
         <w:t xml:space="preserve">  Designed a customer loyalty bonus system enabling shoppers to earn rewards on purchases and redeem across participating partner merchants, conducting stakeholder sessions to define earning rules, eligibility criteria, and partner settlement workflows</w:t>
       </w:r>
@@ -903,7 +903,7 @@
         <w:tabs>
           <w:tab w:val="right" w:pos="9906"/>
         </w:tabs>
-        <w:spacing w:after="16" w:before="120" w:line="260"/>
+        <w:spacing w:after="12" w:before="100" w:line="250"/>
       </w:pPr>
       <w:r>
         <w:rPr>
@@ -920,8 +920,8 @@
         <w:rPr>
           <w:rFonts w:ascii="Calibri" w:eastAsia="Microsoft YaHei"/>
           <w:color w:val="777777"/>
-          <w:sz w:val="18"/>
-          <w:szCs w:val="18"/>
+          <w:sz w:val="19"/>
+          <w:szCs w:val="19"/>
         </w:rPr>
         <w:t xml:space="preserve">  |  </w:t>
       </w:r>
@@ -931,8 +931,8 @@
           <w:i/>
           <w:iCs/>
           <w:color w:val="333333"/>
-          <w:sz w:val="18"/>
-          <w:szCs w:val="18"/>
+          <w:sz w:val="19"/>
+          <w:szCs w:val="19"/>
         </w:rPr>
         <w:t xml:space="preserve">PostgreSQL Developer &amp; L2 Support</w:t>
       </w:r>
@@ -946,39 +946,39 @@
         <w:rPr>
           <w:rFonts w:ascii="Calibri" w:eastAsia="Microsoft YaHei"/>
           <w:color w:val="777777"/>
-          <w:sz w:val="16"/>
-          <w:szCs w:val="16"/>
-        </w:rPr>
-        <w:t xml:space="preserve">2022 – 2024</w:t>
-      </w:r>
-    </w:p>
-    <w:p>
-      <w:pPr>
-        <w:spacing w:after="16" w:before="16" w:line="260"/>
-        <w:ind w:left="160" w:hanging="160"/>
-      </w:pPr>
-      <w:r>
-        <w:rPr>
-          <w:rFonts w:ascii="Calibri" w:eastAsia="Microsoft YaHei"/>
-          <w:color w:val="2A6496"/>
           <w:sz w:val="17"/>
           <w:szCs w:val="17"/>
         </w:rPr>
+        <w:t xml:space="preserve">2022 – 2024</w:t>
+      </w:r>
+    </w:p>
+    <w:p>
+      <w:pPr>
+        <w:spacing w:after="12" w:before="12" w:line="245"/>
+        <w:ind w:left="160" w:hanging="160"/>
+      </w:pPr>
+      <w:r>
+        <w:rPr>
+          <w:rFonts w:ascii="Calibri" w:eastAsia="Microsoft YaHei"/>
+          <w:color w:val="2A6496"/>
+          <w:sz w:val="19"/>
+          <w:szCs w:val="19"/>
+        </w:rPr>
         <w:t xml:space="preserve">•</w:t>
       </w:r>
       <w:r>
         <w:rPr>
           <w:rFonts w:ascii="Calibri" w:eastAsia="Microsoft YaHei"/>
           <w:color w:val="333333"/>
-          <w:sz w:val="17"/>
-          <w:szCs w:val="17"/>
+          <w:sz w:val="19"/>
+          <w:szCs w:val="19"/>
         </w:rPr>
         <w:t xml:space="preserve">  Built backend features using PostgreSQL, resolved L2 production incidents using ELK Stack log analysis and source code investigation, and supported partner development teams with API integration onboarding</w:t>
       </w:r>
     </w:p>
     <w:p>
       <w:pPr>
-        <w:spacing w:after="0" w:before="50"/>
+        <w:spacing w:after="0" w:before="40"/>
       </w:pPr>
     </w:p>
     <w:tbl>
@@ -998,7 +998,7 @@
       </w:tblGrid>
       <w:tr>
         <w:trPr>
-          <w:trHeight w:val="320" w:hRule="exact"/>
+          <w:trHeight w:val="280" w:hRule="exact"/>
         </w:trPr>
         <w:tc>
           <w:tcPr>
@@ -1022,8 +1022,8 @@
                 <w:bCs/>
                 <w:color w:val="2A6496"/>
                 <w:spacing w:val="80"/>
-                <w:sz w:val="19"/>
-                <w:szCs w:val="19"/>
+                <w:sz w:val="22"/>
+                <w:szCs w:val="22"/>
               </w:rPr>
               <w:t xml:space="preserve">TECHNICAL FOUNDATION</w:t>
             </w:r>
@@ -1033,27 +1033,27 @@
     </w:tbl>
     <w:p>
       <w:pPr>
-        <w:spacing w:after="0" w:before="30"/>
-      </w:pPr>
-    </w:p>
-    <w:p>
-      <w:pPr>
-        <w:spacing w:after="16" w:before="16" w:line="260"/>
+        <w:spacing w:after="0" w:before="24"/>
+      </w:pPr>
+    </w:p>
+    <w:p>
+      <w:pPr>
+        <w:spacing w:after="12" w:before="12" w:line="240"/>
         <w:jc w:val="both"/>
       </w:pPr>
       <w:r>
         <w:rPr>
           <w:rFonts w:ascii="Calibri" w:eastAsia="Microsoft YaHei"/>
           <w:color w:val="333333"/>
-          <w:sz w:val="18"/>
-          <w:szCs w:val="18"/>
+          <w:sz w:val="20"/>
+          <w:szCs w:val="20"/>
         </w:rPr>
         <w:t xml:space="preserve">15+ years in software engineering (Central Bank of Azerbaijan, Unibank, ASAN Service) — C# backend development, relational databases (Oracle, MSSQL, PostgreSQL) and NoSQL (MongoDB), system integration, Git, and CI/CD pipelines. Enables precise requirement-to-code translation and rapid root cause analysis during production incidents.</w:t>
       </w:r>
     </w:p>
     <w:p>
       <w:pPr>
-        <w:spacing w:after="0" w:before="50"/>
+        <w:spacing w:after="0" w:before="40"/>
       </w:pPr>
     </w:p>
     <w:tbl>
@@ -1073,7 +1073,7 @@
       </w:tblGrid>
       <w:tr>
         <w:trPr>
-          <w:trHeight w:val="320" w:hRule="exact"/>
+          <w:trHeight w:val="280" w:hRule="exact"/>
         </w:trPr>
         <w:tc>
           <w:tcPr>
@@ -1097,8 +1097,8 @@
                 <w:bCs/>
                 <w:color w:val="2A6496"/>
                 <w:spacing w:val="80"/>
-                <w:sz w:val="19"/>
-                <w:szCs w:val="19"/>
+                <w:sz w:val="22"/>
+                <w:szCs w:val="22"/>
               </w:rPr>
               <w:t xml:space="preserve">EDUCATION</w:t>
             </w:r>
@@ -1108,12 +1108,12 @@
     </w:tbl>
     <w:p>
       <w:pPr>
-        <w:spacing w:after="0" w:before="30"/>
-      </w:pPr>
-    </w:p>
-    <w:p>
-      <w:pPr>
-        <w:spacing w:after="16" w:before="16" w:line="260"/>
+        <w:spacing w:after="0" w:before="24"/>
+      </w:pPr>
+    </w:p>
+    <w:p>
+      <w:pPr>
+        <w:spacing w:after="12" w:before="12" w:line="250"/>
       </w:pPr>
       <w:r>
         <w:rPr>
@@ -1121,8 +1121,8 @@
           <w:b/>
           <w:bCs/>
           <w:color w:val="1A1A1A"/>
-          <w:sz w:val="19"/>
-          <w:szCs w:val="19"/>
+          <w:sz w:val="20"/>
+          <w:szCs w:val="20"/>
         </w:rPr>
         <w:t xml:space="preserve">Baku State University</w:t>
       </w:r>
@@ -1130,8 +1130,8 @@
         <w:rPr>
           <w:rFonts w:ascii="Calibri" w:eastAsia="Microsoft YaHei"/>
           <w:color w:val="777777"/>
-          <w:sz w:val="18"/>
-          <w:szCs w:val="18"/>
+          <w:sz w:val="19"/>
+          <w:szCs w:val="19"/>
         </w:rPr>
         <w:t xml:space="preserve">  —  </w:t>
       </w:r>
@@ -1139,15 +1139,15 @@
         <w:rPr>
           <w:rFonts w:ascii="Calibri" w:eastAsia="Microsoft YaHei"/>
           <w:color w:val="333333"/>
-          <w:sz w:val="18"/>
-          <w:szCs w:val="18"/>
+          <w:sz w:val="19"/>
+          <w:szCs w:val="19"/>
         </w:rPr>
         <w:t xml:space="preserve">Bachelor of Science in Applied Mathematics</w:t>
       </w:r>
     </w:p>
     <w:sectPr>
       <w:pgSz w:w="11906" w:h="16838" w:orient="portrait"/>
-      <w:pgMar w:top="550" w:right="950" w:bottom="450" w:left="950" w:header="708" w:footer="708" w:gutter="0"/>
+      <w:pgMar w:top="480" w:right="850" w:bottom="380" w:left="850" w:header="708" w:footer="708" w:gutter="0"/>
       <w:pgNumType/>
       <w:docGrid w:linePitch="360"/>
     </w:sectPr>

</xml_diff>

<commit_message>
Generalize summary closing for universal use across all employers
</commit_message>
<xml_diff>
--- a/Zamir_Camalov_BA_CV_EN.docx
+++ b/Zamir_Camalov_BA_CV_EN.docx
@@ -4,7 +4,7 @@
   <w:body>
     <w:p>
       <w:pPr>
-        <w:spacing w:after="20" w:before="120" w:line="276"/>
+        <w:spacing w:after="30" w:before="160" w:line="276"/>
         <w:jc w:val="left"/>
       </w:pPr>
       <w:r>
@@ -22,7 +22,7 @@
     </w:p>
     <w:p>
       <w:pPr>
-        <w:spacing w:after="30" w:before="0" w:line="276"/>
+        <w:spacing w:after="50" w:before="0" w:line="276"/>
       </w:pPr>
       <w:r>
         <w:rPr>
@@ -139,7 +139,7 @@
       </w:tblGrid>
       <w:tr>
         <w:trPr>
-          <w:trHeight w:val="280" w:hRule="exact"/>
+          <w:trHeight w:val="320" w:hRule="exact"/>
         </w:trPr>
         <w:tc>
           <w:tcPr>
@@ -189,7 +189,7 @@
           <w:sz w:val="20"/>
           <w:szCs w:val="20"/>
         </w:rPr>
-        <w:t xml:space="preserve">Business Analyst with 2+ years across fintech and e-commerce, specializing in process digitization, requirements documentation, and end-to-end delivery coordination. Engineering background enables precise translation of business needs into technical specifications. Having delivered production systems in financial services, now looking to bring the same analytical approach to retail process optimization.</w:t>
+        <w:t xml:space="preserve">Business Analyst with 2+ years across fintech and e-commerce, specializing in process digitization, requirements documentation, and end-to-end delivery coordination. Engineering background enables precise translation of business needs into technical specifications. Having delivered production systems across fintech and e-commerce, looking to apply the same analytical approach to drive measurable business outcomes.</w:t>
       </w:r>
     </w:p>
     <w:p>
@@ -214,7 +214,7 @@
       </w:tblGrid>
       <w:tr>
         <w:trPr>
-          <w:trHeight w:val="280" w:hRule="exact"/>
+          <w:trHeight w:val="320" w:hRule="exact"/>
         </w:trPr>
         <w:tc>
           <w:tcPr>
@@ -406,7 +406,7 @@
       </w:tblGrid>
       <w:tr>
         <w:trPr>
-          <w:trHeight w:val="280" w:hRule="exact"/>
+          <w:trHeight w:val="320" w:hRule="exact"/>
         </w:trPr>
         <w:tc>
           <w:tcPr>
@@ -998,7 +998,7 @@
       </w:tblGrid>
       <w:tr>
         <w:trPr>
-          <w:trHeight w:val="280" w:hRule="exact"/>
+          <w:trHeight w:val="320" w:hRule="exact"/>
         </w:trPr>
         <w:tc>
           <w:tcPr>
@@ -1073,7 +1073,7 @@
       </w:tblGrid>
       <w:tr>
         <w:trPr>
-          <w:trHeight w:val="280" w:hRule="exact"/>
+          <w:trHeight w:val="320" w:hRule="exact"/>
         </w:trPr>
         <w:tc>
           <w:tcPr>
@@ -1147,7 +1147,7 @@
     </w:p>
     <w:sectPr>
       <w:pgSz w:w="11906" w:h="16838" w:orient="portrait"/>
-      <w:pgMar w:top="480" w:right="850" w:bottom="380" w:left="850" w:header="708" w:footer="708" w:gutter="0"/>
+      <w:pgMar w:top="450" w:right="850" w:bottom="340" w:left="850" w:header="708" w:footer="708" w:gutter="0"/>
       <w:pgNumType/>
       <w:docGrid w:linePitch="360"/>
     </w:sectPr>

</xml_diff>